<commit_message>
Fit complete UML and captions on an A4 landscape report page
</commit_message>
<xml_diff>
--- a/reports/strategy-pattern-report.docx
+++ b/reports/strategy-pattern-report.docx
@@ -440,7 +440,7 @@
       <w:r>
         <w:drawing>
           <wp:inline xmlns:a="http://schemas.openxmlformats.org/drawingml/2006/main" xmlns:pic="http://schemas.openxmlformats.org/drawingml/2006/picture">
-            <wp:extent cx="13990320" cy="6499670"/>
+            <wp:extent cx="9235440" cy="4137477"/>
             <wp:docPr id="1" name="Picture 1" descr="Complete Strategy calculator UML with the client, context, interface, four concrete strategies and both test classes, including all source fields, methods and explicit constructors."/>
             <wp:cNvGraphicFramePr>
               <a:graphicFrameLocks noChangeAspect="1"/>
@@ -461,7 +461,7 @@
                   <pic:spPr>
                     <a:xfrm>
                       <a:off x="0" y="0"/>
-                      <a:ext cx="13990320" cy="6499670"/>
+                      <a:ext cx="9235440" cy="4137477"/>
                     </a:xfrm>
                     <a:prstGeom prst="rect"/>
                   </pic:spPr>
@@ -485,7 +485,7 @@
     <w:p>
       <w:pPr>
         <w:sectPr>
-          <w:pgSz w:w="23818" w:h="16834" w:orient="landscape"/>
+          <w:pgSz w:w="16834" w:h="11909" w:orient="landscape"/>
           <w:pgMar w:top="720" w:right="792" w:bottom="720" w:left="792" w:header="720" w:footer="720" w:gutter="0"/>
           <w:cols w:space="720"/>
           <w:docGrid w:linePitch="360"/>

</xml_diff>

<commit_message>
Shorten report to essential assignment sections and five Clean Code examples
</commit_message>
<xml_diff>
--- a/reports/strategy-pattern-report.docx
+++ b/reports/strategy-pattern-report.docx
@@ -7,7 +7,7 @@
         <w:pStyle w:val="Title"/>
       </w:pPr>
       <w:r>
-        <w:t>Strategy Calculator Assignment Report</w:t>
+        <w:t>Strategy Calculator</w:t>
       </w:r>
     </w:p>
     <w:p>
@@ -15,12 +15,7 @@
         <w:pStyle w:val="Subtitle"/>
       </w:pPr>
       <w:r>
-        <w:t>Assignment 5 Software Design Patterns Java 17</w:t>
-      </w:r>
-    </w:p>
-    <w:p>
-      <w:r>
-        <w:t>24 October 2026</w:t>
+        <w:t>Assignment 5 Software Design Patterns</w:t>
       </w:r>
     </w:p>
     <w:p>
@@ -33,415 +28,32 @@
     </w:p>
     <w:p>
       <w:r>
-        <w:t>This project uses the assignment's suggested Calculator topic. Addition, subtraction, multiplication, and division form a family of interchangeable algorithms. Calculator stores a CalculationStrategy and delegates calculation through that contract. CalculatorDemo selects strategies and replaces them on one context at runtime.</w:t>
+        <w:t>The project is a calculator with four interchangeable algorithms: addition, subtraction, multiplication, and division. CalculatorDemo chooses a CalculationStrategy for Calculator. The same Calculator object switches algorithms at runtime. For inputs 20 and 4, the four strategies return 24, 16, 80, and 5.</w:t>
       </w:r>
     </w:p>
     <w:p>
       <w:r>
-        <w:t>BigDecimal operands preserve exact decimal addition, subtraction, and multiplication. Division uses DECIMAL64: 16 significant digits with HALF_EVEN rounding. A zero divisor raises ArithmeticException. The console client catches the expected error and continues; it needs no arguments or interactive input.</w:t>
+        <w:t>BigDecimal handles decimal values. Division uses DECIMAL64 rounding and rejects zero divisors. All 30 unit tests passed.</w:t>
       </w:r>
-    </w:p>
-    <w:p>
-      <w:pPr>
-        <w:pStyle w:val="Heading2"/>
-      </w:pPr>
-      <w:r>
-        <w:t>Pattern participants</w:t>
-      </w:r>
-    </w:p>
-    <w:tbl>
-      <w:tblPr>
-        <w:tblW w:type="auto" w:w="0"/>
-        <w:jc w:val="center"/>
-        <w:tblLayout w:type="fixed"/>
-        <w:tblLook w:firstColumn="1" w:firstRow="1" w:lastColumn="0" w:lastRow="0" w:noHBand="0" w:noVBand="1" w:val="04A0"/>
-        <w:tblBorders>
-          <w:top w:val="single" w:sz="5" w:color="D9D9D9"/>
-          <w:left w:val="single" w:sz="5" w:color="D9D9D9"/>
-          <w:bottom w:val="single" w:sz="5" w:color="D9D9D9"/>
-          <w:right w:val="single" w:sz="5" w:color="D9D9D9"/>
-          <w:insideH w:val="single" w:sz="5" w:color="D9D9D9"/>
-          <w:insideV w:val="single" w:sz="5" w:color="D9D9D9"/>
-        </w:tblBorders>
-      </w:tblPr>
-      <w:tblGrid>
-        <w:gridCol w:w="2088"/>
-        <w:gridCol w:w="7632"/>
-      </w:tblGrid>
-      <w:tr>
-        <w:trPr>
-          <w:cantSplit/>
-          <w:tblHeader/>
-        </w:trPr>
-        <w:tc>
-          <w:tcPr>
-            <w:tcW w:type="dxa" w:w="2088"/>
-            <w:vAlign w:val="center"/>
-            <w:shd w:fill="233F55"/>
-            <w:tcMar>
-              <w:top w:w="85" w:type="dxa"/>
-              <w:left w:w="85" w:type="dxa"/>
-              <w:bottom w:w="85" w:type="dxa"/>
-              <w:right w:w="85" w:type="dxa"/>
-            </w:tcMar>
-          </w:tcPr>
-          <w:p>
-            <w:pPr>
-              <w:spacing w:after="20" w:line="250" w:lineRule="auto"/>
-            </w:pPr>
-            <w:r>
-              <w:rPr>
-                <w:b/>
-                <w:color w:val="FFFFFF"/>
-                <w:sz w:val="19"/>
-              </w:rPr>
-              <w:t>Role</w:t>
-            </w:r>
-          </w:p>
-        </w:tc>
-        <w:tc>
-          <w:tcPr>
-            <w:tcW w:type="dxa" w:w="7632"/>
-            <w:vAlign w:val="center"/>
-            <w:shd w:fill="233F55"/>
-            <w:tcMar>
-              <w:top w:w="85" w:type="dxa"/>
-              <w:left w:w="85" w:type="dxa"/>
-              <w:bottom w:w="85" w:type="dxa"/>
-              <w:right w:w="85" w:type="dxa"/>
-            </w:tcMar>
-          </w:tcPr>
-          <w:p>
-            <w:pPr>
-              <w:spacing w:after="20" w:line="250" w:lineRule="auto"/>
-            </w:pPr>
-            <w:r>
-              <w:rPr>
-                <w:b/>
-                <w:color w:val="FFFFFF"/>
-                <w:sz w:val="19"/>
-              </w:rPr>
-              <w:t>Types and responsibility</w:t>
-            </w:r>
-          </w:p>
-        </w:tc>
-      </w:tr>
-      <w:tr>
-        <w:trPr>
-          <w:cantSplit/>
-        </w:trPr>
-        <w:tc>
-          <w:tcPr>
-            <w:tcW w:type="dxa" w:w="2088"/>
-            <w:vAlign w:val="center"/>
-            <w:shd w:fill="FFFFFF"/>
-            <w:tcMar>
-              <w:top w:w="85" w:type="dxa"/>
-              <w:left w:w="85" w:type="dxa"/>
-              <w:bottom w:w="85" w:type="dxa"/>
-              <w:right w:w="85" w:type="dxa"/>
-            </w:tcMar>
-          </w:tcPr>
-          <w:p>
-            <w:pPr>
-              <w:spacing w:after="20" w:line="250" w:lineRule="auto"/>
-            </w:pPr>
-            <w:r>
-              <w:rPr>
-                <w:sz w:val="19"/>
-              </w:rPr>
-              <w:t>Client</w:t>
-            </w:r>
-          </w:p>
-        </w:tc>
-        <w:tc>
-          <w:tcPr>
-            <w:tcW w:type="dxa" w:w="7632"/>
-            <w:vAlign w:val="center"/>
-            <w:shd w:fill="FFFFFF"/>
-            <w:tcMar>
-              <w:top w:w="85" w:type="dxa"/>
-              <w:left w:w="85" w:type="dxa"/>
-              <w:bottom w:w="85" w:type="dxa"/>
-              <w:right w:w="85" w:type="dxa"/>
-            </w:tcMar>
-          </w:tcPr>
-          <w:p>
-            <w:pPr>
-              <w:spacing w:after="20" w:line="250" w:lineRule="auto"/>
-            </w:pPr>
-            <w:r>
-              <w:rPr>
-                <w:sz w:val="19"/>
-              </w:rPr>
-              <w:t>CalculatorDemo creates and selects concrete strategies and presents results.</w:t>
-            </w:r>
-          </w:p>
-        </w:tc>
-      </w:tr>
-      <w:tr>
-        <w:trPr>
-          <w:cantSplit/>
-        </w:trPr>
-        <w:tc>
-          <w:tcPr>
-            <w:tcW w:type="dxa" w:w="2088"/>
-            <w:vAlign w:val="center"/>
-            <w:shd w:fill="F0F4F7"/>
-            <w:tcMar>
-              <w:top w:w="85" w:type="dxa"/>
-              <w:left w:w="85" w:type="dxa"/>
-              <w:bottom w:w="85" w:type="dxa"/>
-              <w:right w:w="85" w:type="dxa"/>
-            </w:tcMar>
-          </w:tcPr>
-          <w:p>
-            <w:pPr>
-              <w:spacing w:after="20" w:line="250" w:lineRule="auto"/>
-            </w:pPr>
-            <w:r>
-              <w:rPr>
-                <w:sz w:val="19"/>
-              </w:rPr>
-              <w:t>Context</w:t>
-            </w:r>
-          </w:p>
-        </w:tc>
-        <w:tc>
-          <w:tcPr>
-            <w:tcW w:type="dxa" w:w="7632"/>
-            <w:vAlign w:val="center"/>
-            <w:shd w:fill="F0F4F7"/>
-            <w:tcMar>
-              <w:top w:w="85" w:type="dxa"/>
-              <w:left w:w="85" w:type="dxa"/>
-              <w:bottom w:w="85" w:type="dxa"/>
-              <w:right w:w="85" w:type="dxa"/>
-            </w:tcMar>
-          </w:tcPr>
-          <w:p>
-            <w:pPr>
-              <w:spacing w:after="20" w:line="250" w:lineRule="auto"/>
-            </w:pPr>
-            <w:r>
-              <w:rPr>
-                <w:sz w:val="19"/>
-              </w:rPr>
-              <w:t>Calculator stores one CalculationStrategy and delegates each calculation.</w:t>
-            </w:r>
-          </w:p>
-        </w:tc>
-      </w:tr>
-      <w:tr>
-        <w:trPr>
-          <w:cantSplit/>
-        </w:trPr>
-        <w:tc>
-          <w:tcPr>
-            <w:tcW w:type="dxa" w:w="2088"/>
-            <w:vAlign w:val="center"/>
-            <w:shd w:fill="FFFFFF"/>
-            <w:tcMar>
-              <w:top w:w="85" w:type="dxa"/>
-              <w:left w:w="85" w:type="dxa"/>
-              <w:bottom w:w="85" w:type="dxa"/>
-              <w:right w:w="85" w:type="dxa"/>
-            </w:tcMar>
-          </w:tcPr>
-          <w:p>
-            <w:pPr>
-              <w:spacing w:after="20" w:line="250" w:lineRule="auto"/>
-            </w:pPr>
-            <w:r>
-              <w:rPr>
-                <w:sz w:val="19"/>
-              </w:rPr>
-              <w:t>Strategy interface</w:t>
-            </w:r>
-          </w:p>
-        </w:tc>
-        <w:tc>
-          <w:tcPr>
-            <w:tcW w:type="dxa" w:w="7632"/>
-            <w:vAlign w:val="center"/>
-            <w:shd w:fill="FFFFFF"/>
-            <w:tcMar>
-              <w:top w:w="85" w:type="dxa"/>
-              <w:left w:w="85" w:type="dxa"/>
-              <w:bottom w:w="85" w:type="dxa"/>
-              <w:right w:w="85" w:type="dxa"/>
-            </w:tcMar>
-          </w:tcPr>
-          <w:p>
-            <w:pPr>
-              <w:spacing w:after="20" w:line="250" w:lineRule="auto"/>
-            </w:pPr>
-            <w:r>
-              <w:rPr>
-                <w:sz w:val="19"/>
-              </w:rPr>
-              <w:t>CalculationStrategy declares one common calculate operation.</w:t>
-            </w:r>
-          </w:p>
-        </w:tc>
-      </w:tr>
-      <w:tr>
-        <w:trPr>
-          <w:cantSplit/>
-        </w:trPr>
-        <w:tc>
-          <w:tcPr>
-            <w:tcW w:type="dxa" w:w="2088"/>
-            <w:vAlign w:val="center"/>
-            <w:shd w:fill="F0F4F7"/>
-            <w:tcMar>
-              <w:top w:w="85" w:type="dxa"/>
-              <w:left w:w="85" w:type="dxa"/>
-              <w:bottom w:w="85" w:type="dxa"/>
-              <w:right w:w="85" w:type="dxa"/>
-            </w:tcMar>
-          </w:tcPr>
-          <w:p>
-            <w:pPr>
-              <w:spacing w:after="20" w:line="250" w:lineRule="auto"/>
-            </w:pPr>
-            <w:r>
-              <w:rPr>
-                <w:sz w:val="19"/>
-              </w:rPr>
-              <w:t>Concrete strategies</w:t>
-            </w:r>
-          </w:p>
-        </w:tc>
-        <w:tc>
-          <w:tcPr>
-            <w:tcW w:type="dxa" w:w="7632"/>
-            <w:vAlign w:val="center"/>
-            <w:shd w:fill="F0F4F7"/>
-            <w:tcMar>
-              <w:top w:w="85" w:type="dxa"/>
-              <w:left w:w="85" w:type="dxa"/>
-              <w:bottom w:w="85" w:type="dxa"/>
-              <w:right w:w="85" w:type="dxa"/>
-            </w:tcMar>
-          </w:tcPr>
-          <w:p>
-            <w:pPr>
-              <w:spacing w:after="20" w:line="250" w:lineRule="auto"/>
-            </w:pPr>
-            <w:r>
-              <w:rPr>
-                <w:sz w:val="19"/>
-              </w:rPr>
-              <w:t>AdditionStrategy, SubtractionStrategy, MultiplicationStrategy, DivisionStrategy.</w:t>
-            </w:r>
-          </w:p>
-        </w:tc>
-      </w:tr>
-      <w:tr>
-        <w:trPr>
-          <w:cantSplit/>
-        </w:trPr>
-        <w:tc>
-          <w:tcPr>
-            <w:tcW w:type="dxa" w:w="2088"/>
-            <w:vAlign w:val="center"/>
-            <w:shd w:fill="FFFFFF"/>
-            <w:tcMar>
-              <w:top w:w="85" w:type="dxa"/>
-              <w:left w:w="85" w:type="dxa"/>
-              <w:bottom w:w="85" w:type="dxa"/>
-              <w:right w:w="85" w:type="dxa"/>
-            </w:tcMar>
-          </w:tcPr>
-          <w:p>
-            <w:pPr>
-              <w:spacing w:after="20" w:line="250" w:lineRule="auto"/>
-            </w:pPr>
-            <w:r>
-              <w:rPr>
-                <w:sz w:val="19"/>
-              </w:rPr>
-              <w:t>Tests</w:t>
-            </w:r>
-          </w:p>
-        </w:tc>
-        <w:tc>
-          <w:tcPr>
-            <w:tcW w:type="dxa" w:w="7632"/>
-            <w:vAlign w:val="center"/>
-            <w:shd w:fill="FFFFFF"/>
-            <w:tcMar>
-              <w:top w:w="85" w:type="dxa"/>
-              <w:left w:w="85" w:type="dxa"/>
-              <w:bottom w:w="85" w:type="dxa"/>
-              <w:right w:w="85" w:type="dxa"/>
-            </w:tcMar>
-          </w:tcPr>
-          <w:p>
-            <w:pPr>
-              <w:spacing w:after="20" w:line="250" w:lineRule="auto"/>
-            </w:pPr>
-            <w:r>
-              <w:rPr>
-                <w:sz w:val="19"/>
-              </w:rPr>
-              <w:t>CalculatorTest checks the context contract; StrategyTest checks arithmetic variants.</w:t>
-            </w:r>
-          </w:p>
-        </w:tc>
-      </w:tr>
-    </w:tbl>
-    <w:p>
-      <w:pPr>
-        <w:spacing w:after="20"/>
-      </w:pPr>
-    </w:p>
-    <w:p>
-      <w:pPr>
-        <w:pStyle w:val="Heading2"/>
-      </w:pPr>
-      <w:r>
-        <w:t>Visible runtime switching</w:t>
-      </w:r>
-    </w:p>
-    <w:p>
-      <w:r>
-        <w:t>One no-argument run prints the client's strategy choice, operands, delegation action, and result. With the same operands 20 and 4, changing the strategy produces 24, 16, 80, and 5. The run also demonstrates exact decimals, a recurring quotient, a rejected zero divisor, recovery, and switching back.</w:t>
-      </w:r>
-    </w:p>
-    <w:p>
-      <w:r>
-        <w:t>The Markdown reflection is included as reports/strategy-pattern-report.md. This Word version includes a larger UML page and a source declaration appendix.</w:t>
-      </w:r>
-    </w:p>
-    <w:p>
-      <w:pPr>
-        <w:sectPr>
-          <w:pgSz w:w="11909" w:h="16834"/>
-          <w:pgMar w:top="936" w:right="1080" w:bottom="936" w:left="1080" w:header="720" w:footer="720" w:gutter="0"/>
-          <w:cols w:space="720"/>
-          <w:docGrid w:linePitch="360"/>
-        </w:sectPr>
-      </w:pPr>
     </w:p>
     <w:p>
       <w:pPr>
         <w:pStyle w:val="Heading1"/>
       </w:pPr>
       <w:r>
-        <w:t>2 Complete UML Class Diagram</w:t>
+        <w:t>2 UML Class Diagram</w:t>
       </w:r>
     </w:p>
     <w:p>
       <w:pPr>
+        <w:spacing w:after="60" w:line="240" w:lineRule="auto"/>
         <w:jc w:val="center"/>
       </w:pPr>
       <w:r>
         <w:drawing>
           <wp:inline xmlns:a="http://schemas.openxmlformats.org/drawingml/2006/main" xmlns:pic="http://schemas.openxmlformats.org/drawingml/2006/picture">
             <wp:extent cx="9235440" cy="4137477"/>
-            <wp:docPr id="1" name="Picture 1" descr="Complete Strategy calculator UML with the client, context, interface, four concrete strategies and both test classes, including all source fields, methods and explicit constructors."/>
+            <wp:docPr id="1" name="Picture 1" descr="Complete calculator Strategy UML with the client, context, interface, four algorithms, two test classes, and all declared fields, methods and explicit constructors."/>
             <wp:cNvGraphicFramePr>
               <a:graphicFrameLocks noChangeAspect="1"/>
             </wp:cNvGraphicFramePr>
@@ -474,19 +86,14 @@
     </w:p>
     <w:p>
       <w:r>
-        <w:t>Figure 1. All authored Java types: 6 application classes, 1 interface, and 2 test classes. Static methods are underlined; the abstract interface operation is italic. The mutable strategy field supports replacing the one current strategy. Dashed hollow triangles show realization; other client/test dependencies are listed as notes to avoid crossing member text. They are also explicit in the editable PlantUML source.</w:t>
-      </w:r>
-    </w:p>
-    <w:p>
-      <w:r>
-        <w:t>Source inventory: 8 classes, 1 interface, 1 field, 23 methods, and 2 explicit constructors. Parameters appear in signatures; local declarations are listed in Appendix A. Library types and implicit constructors are outside the authored-type count.</w:t>
+        <w:t>CalculatorDemo is the client, Calculator is the context, and CalculationStrategy is the common interface. Four classes implement the algorithms. The diagram also includes both test classes, all declared fields, methods, and explicit constructors.</w:t>
       </w:r>
     </w:p>
     <w:p>
       <w:pPr>
         <w:sectPr>
           <w:pgSz w:w="16834" w:h="11909" w:orient="landscape"/>
-          <w:pgMar w:top="720" w:right="792" w:bottom="720" w:left="792" w:header="720" w:footer="720" w:gutter="0"/>
+          <w:pgMar w:top="648" w:right="792" w:bottom="648" w:left="792" w:header="720" w:footer="720" w:gutter="0"/>
           <w:cols w:space="720"/>
           <w:docGrid w:linePitch="360"/>
         </w:sectPr>
@@ -497,12 +104,7 @@
         <w:pStyle w:val="Heading1"/>
       </w:pPr>
       <w:r>
-        <w:t>3 Clean Code Chapters 9 10 and 11</w:t>
-      </w:r>
-    </w:p>
-    <w:p>
-      <w:r>
-        <w:t>The following seven applications use the requested chapters. Excerpts are annotated versions of the submitted implementation. Names also reveal each algorithm, while the counted principles focus on tests, classes, and system construction.</w:t>
+        <w:t>3 Clean Code</w:t>
       </w:r>
     </w:p>
     <w:p>
@@ -510,12 +112,18 @@
         <w:pStyle w:val="Heading2"/>
       </w:pPr>
       <w:r>
-        <w:t>Readable tests</w:t>
+        <w:t>Clear and independent tests</w:t>
       </w:r>
     </w:p>
     <w:p>
       <w:r>
-        <w:t>Chapter 9 Unit Tests. Tests make the setup, action, and expected result visible. customStrategyWorksWithoutContextChanges uses one small scenario to prove delegation. This follows the Build Operate Check structure.</w:t>
+        <w:rPr>
+          <w:b/>
+        </w:rPr>
+        <w:t xml:space="preserve">Chapter 9. </w:t>
+      </w:r>
+      <w:r>
+        <w:t>Each test creates its own data, runs one operation, and checks the result. Fixed inputs make tests repeatable.</w:t>
       </w:r>
     </w:p>
     <w:p>
@@ -523,15 +131,11 @@
         <w:pStyle w:val="Codeexcerpt"/>
       </w:pPr>
       <w:r>
-        <w:t>// Build: inject a predictable algorithm.</w:t>
+        <w:t>// Setup, operation, and check use fixed data.</w:t>
         <w:br/>
         <w:t>Calculator calculator = new Calculator((left, right) -&gt; new BigDecimal("42"));</w:t>
         <w:br/>
-        <w:t>// Operate.</w:t>
-        <w:br/>
         <w:t>BigDecimal result = calculator.calculate(BigDecimal.ONE, BigDecimal.TEN);</w:t>
-        <w:br/>
-        <w:t>// Check.</w:t>
         <w:br/>
         <w:t>assertEquals(new BigDecimal("42"), result);</w:t>
       </w:r>
@@ -541,12 +145,18 @@
         <w:pStyle w:val="Heading2"/>
       </w:pPr>
       <w:r>
-        <w:t>Independent and repeatable tests</w:t>
+        <w:t>Single responsibility</w:t>
       </w:r>
     </w:p>
     <w:p>
       <w:r>
-        <w:t>Chapter 9 Unit Tests. Each test creates its own context or stateless strategy. Tests use fixed numbers and no network, files, clock, or random input. JUnit makes success automatic. This applies the fast, independent, repeatable, and self validating parts of FIRST; no claim of a complete TDD process is made.</w:t>
+        <w:rPr>
+          <w:b/>
+        </w:rPr>
+        <w:t xml:space="preserve">Chapter 10. </w:t>
+      </w:r>
+      <w:r>
+        <w:t>Each strategy contains one arithmetic operation. Calculator delegates execution, while CalculatorDemo selects strategies and prints results.</w:t>
       </w:r>
     </w:p>
     <w:p>
@@ -554,34 +164,7 @@
         <w:pStyle w:val="Codeexcerpt"/>
       </w:pPr>
       <w:r>
-        <w:t>// A fresh object prevents dependence on an earlier test.</w:t>
-        <w:br/>
-        <w:t>Calculator calculator = new Calculator(new AdditionStrategy());</w:t>
-        <w:br/>
-        <w:t>assertThrows(NullPointerException.class,</w:t>
-        <w:br/>
-        <w:t xml:space="preserve">    () -&gt; calculator.calculate(null, BigDecimal.ONE));</w:t>
-      </w:r>
-    </w:p>
-    <w:p>
-      <w:pPr>
-        <w:pStyle w:val="Heading2"/>
-      </w:pPr>
-      <w:r>
-        <w:t>Small classes with one responsibility</w:t>
-      </w:r>
-    </w:p>
-    <w:p>
-      <w:r>
-        <w:t>Chapter 10 Classes. Each concrete strategy implements one arithmetic algorithm. Calculator coordinates delegation and null checks; CalculatorDemo selects strategies and presents results. Algorithm names reveal their purpose, and arithmetic classes contain no console presentation.</w:t>
-      </w:r>
-    </w:p>
-    <w:p>
-      <w:pPr>
-        <w:pStyle w:val="Codeexcerpt"/>
-      </w:pPr>
-      <w:r>
-        <w:t>// AdditionStrategy owns only the addition algorithm.</w:t>
+        <w:t>// AdditionStrategy owns the addition algorithm.</w:t>
         <w:br/>
         <w:t>public BigDecimal calculate(BigDecimal left, BigDecimal right) {</w:t>
         <w:br/>
@@ -591,16 +174,34 @@
       </w:r>
     </w:p>
     <w:p>
+      <w:pPr>
+        <w:pStyle w:val="Heading2"/>
+      </w:pPr>
       <w:r>
-        <w:br w:type="page"/>
+        <w:t>Independence from concrete algorithms</w:t>
+      </w:r>
+    </w:p>
+    <w:p>
+      <w:r>
+        <w:rPr>
+          <w:b/>
+        </w:rPr>
+        <w:t xml:space="preserve">Chapter 10. </w:t>
+      </w:r>
+      <w:r>
+        <w:t>Calculator depends on CalculationStrategy and delegates through it. It has no if or switch for selecting an operation.</w:t>
       </w:r>
     </w:p>
     <w:p>
       <w:pPr>
-        <w:pStyle w:val="Heading1"/>
+        <w:pStyle w:val="Codeexcerpt"/>
       </w:pPr>
       <w:r>
-        <w:t>Clean Code continued</w:t>
+        <w:t>private CalculationStrategy strategy;</w:t>
+        <w:br/>
+        <w:t>// After checking the operands, delegate through the interface.</w:t>
+        <w:br/>
+        <w:t>return strategy.calculate(left, right);</w:t>
       </w:r>
     </w:p>
     <w:p>
@@ -613,7 +214,13 @@
     </w:p>
     <w:p>
       <w:r>
-        <w:t>Chapter 10 Classes. DivisionStrategy was added after the original three strategies. Git history shows that Calculator, CalculationStrategy, and the three existing algorithm classes stayed unchanged. The client composition and tests were updated to select and exercise the new strategy.</w:t>
+        <w:rPr>
+          <w:b/>
+        </w:rPr>
+        <w:t xml:space="preserve">Chapter 10. </w:t>
+      </w:r>
+      <w:r>
+        <w:t>DivisionStrategy implements the same contract. Adding it required no changes to Calculator, CalculationStrategy, or the three existing strategies.</w:t>
       </w:r>
     </w:p>
     <w:p>
@@ -621,7 +228,7 @@
         <w:pStyle w:val="Codeexcerpt"/>
       </w:pPr>
       <w:r>
-        <w:t>// New implementation; the context does not change.</w:t>
+        <w:t>// DivisionStrategy adds an algorithm without changing the context.</w:t>
         <w:br/>
         <w:t>public BigDecimal calculate(BigDecimal left, BigDecimal right) {</w:t>
         <w:br/>
@@ -635,12 +242,18 @@
         <w:pStyle w:val="Heading2"/>
       </w:pPr>
       <w:r>
-        <w:t>Isolating the context from concrete algorithms</w:t>
+        <w:t>Separate construction from use</w:t>
       </w:r>
     </w:p>
     <w:p>
       <w:r>
-        <w:t>Chapter 10 Classes. Calculator depends on CalculationStrategy. Its calculation method performs the same delegation for every operation. There is no if, switch, instanceof, or strategy type name in the context. Polymorphism replaces conditional algorithm selection.</w:t>
+        <w:rPr>
+          <w:b/>
+        </w:rPr>
+        <w:t xml:space="preserve">Chapter 11. </w:t>
+      </w:r>
+      <w:r>
+        <w:t>CalculatorDemo creates strategies and passes them to Calculator. Calling setStrategy changes the algorithm while the Calculator object stays the same.</w:t>
       </w:r>
     </w:p>
     <w:p>
@@ -648,66 +261,11 @@
         <w:pStyle w:val="Codeexcerpt"/>
       </w:pPr>
       <w:r>
-        <w:t>// Calculator knows the contract, not a concrete algorithm.</w:t>
+        <w:t>// The client creates and replaces the algorithm.</w:t>
         <w:br/>
-        <w:t>private CalculationStrategy strategy;</w:t>
-        <w:br/>
-        <w:t>// After shared operand checks:</w:t>
-        <w:br/>
-        <w:t>return strategy.calculate(left, right);</w:t>
-      </w:r>
-    </w:p>
-    <w:p>
-      <w:pPr>
-        <w:pStyle w:val="Heading2"/>
-      </w:pPr>
-      <w:r>
-        <w:t>Separate construction from use</w:t>
-      </w:r>
-    </w:p>
-    <w:p>
-      <w:r>
-        <w:t>Chapter 11 Systems. CalculatorDemo is the composition root: it constructs concrete strategies and injects them. Calculator receives a ready strategy through its constructor or setter and never creates concrete algorithms. Runtime switching replaces the reference on the same context.</w:t>
-      </w:r>
-    </w:p>
-    <w:p>
-      <w:pPr>
-        <w:pStyle w:val="Codeexcerpt"/>
-      </w:pPr>
-      <w:r>
         <w:t>Calculator calculator = new Calculator(new AdditionStrategy());</w:t>
         <w:br/>
         <w:t>calculator.setStrategy(new SubtractionStrategy());</w:t>
-        <w:br/>
-        <w:t>calculator.setStrategy(new MultiplicationStrategy());</w:t>
-      </w:r>
-    </w:p>
-    <w:p>
-      <w:pPr>
-        <w:pStyle w:val="Heading2"/>
-      </w:pPr>
-      <w:r>
-        <w:t>Testable system boundaries through injection</w:t>
-      </w:r>
-    </w:p>
-    <w:p>
-      <w:r>
-        <w:t>Chapter 11 Systems. A small strategy contract lets a test replace arithmetic with a deterministic lambda. The context can therefore be tested independently from actual arithmetic. Manual injection is enough for this small application; a dependency injection framework would add unnecessary setup.</w:t>
-      </w:r>
-    </w:p>
-    <w:p>
-      <w:pPr>
-        <w:pStyle w:val="Codeexcerpt"/>
-      </w:pPr>
-      <w:r>
-        <w:t>// Any implementation of the contract can be injected.</w:t>
-        <w:br/>
-        <w:t>Calculator calculator = new Calculator((left, right) -&gt; new BigDecimal("42"));</w:t>
-      </w:r>
-    </w:p>
-    <w:p>
-      <w:r>
-        <w:br w:type="page"/>
       </w:r>
     </w:p>
     <w:p>
@@ -715,411 +273,12 @@
         <w:pStyle w:val="Heading1"/>
       </w:pPr>
       <w:r>
-        <w:t>4 Live Demonstration</w:t>
+        <w:t>4 Conclusion</w:t>
       </w:r>
     </w:p>
     <w:p>
       <w:r>
-        <w:t>Run CalculatorDemo.main() without arguments. The same context produces 24, 16, 80, and 5 for operands 20 and 4 as the client selects addition, subtraction, multiplication, and division. Additional examples cover decimals, negatives, repeating division, division by zero, recovery, and switching back to addition.</w:t>
-      </w:r>
-    </w:p>
-    <w:p>
-      <w:pPr>
-        <w:pStyle w:val="Codeexcerpt"/>
-      </w:pPr>
-      <w:r>
-        <w:t>Same operands 20 and 4 on one context</w:t>
-        <w:br/>
-        <w:t>Addition          Result: 24</w:t>
-        <w:br/>
-        <w:t>Subtraction       Result: 16</w:t>
-        <w:br/>
-        <w:t>Multiplication    Result: 80</w:t>
-        <w:br/>
-        <w:t>Division          Result: 5</w:t>
-        <w:br/>
-        <w:br/>
-        <w:t>Rejected as expected: Division by zero</w:t>
-        <w:br/>
-        <w:t>Division after rejection: 9 and 3 -&gt; 3</w:t>
-        <w:br/>
-        <w:t>Switch back to addition: 20 and 4 -&gt; 24</w:t>
-        <w:br/>
-        <w:t>DEMONSTRATION COMPLETED SUCCESSFULLY</w:t>
-      </w:r>
-    </w:p>
-    <w:p>
-      <w:pPr>
-        <w:pStyle w:val="Heading2"/>
-      </w:pPr>
-      <w:r>
-        <w:t>Validation</w:t>
-      </w:r>
-    </w:p>
-    <w:p>
-      <w:r>
-        <w:t>On 24 October 2026, Maven verify with JDK 17 passed all 30 JUnit cases with zero failures, errors, or skipped cases. Two packaged JAR runs produced identical 62-line output. The Windows launcher also compiled the production classes and completed the same demonstration. A source audit confirmed that the context contains no strategy-selection branches or concrete strategy references.</w:t>
-      </w:r>
-    </w:p>
-    <w:tbl>
-      <w:tblPr>
-        <w:tblW w:type="auto" w:w="0"/>
-        <w:jc w:val="center"/>
-        <w:tblLayout w:type="fixed"/>
-        <w:tblLook w:firstColumn="1" w:firstRow="1" w:lastColumn="0" w:lastRow="0" w:noHBand="0" w:noVBand="1" w:val="04A0"/>
-        <w:tblBorders>
-          <w:top w:val="single" w:sz="5" w:color="D9D9D9"/>
-          <w:left w:val="single" w:sz="5" w:color="D9D9D9"/>
-          <w:bottom w:val="single" w:sz="5" w:color="D9D9D9"/>
-          <w:right w:val="single" w:sz="5" w:color="D9D9D9"/>
-          <w:insideH w:val="single" w:sz="5" w:color="D9D9D9"/>
-          <w:insideV w:val="single" w:sz="5" w:color="D9D9D9"/>
-        </w:tblBorders>
-      </w:tblPr>
-      <w:tblGrid>
-        <w:gridCol w:w="1872"/>
-        <w:gridCol w:w="7848"/>
-      </w:tblGrid>
-      <w:tr>
-        <w:trPr>
-          <w:cantSplit/>
-          <w:tblHeader/>
-        </w:trPr>
-        <w:tc>
-          <w:tcPr>
-            <w:tcW w:type="dxa" w:w="1872"/>
-            <w:vAlign w:val="center"/>
-            <w:shd w:fill="233F55"/>
-            <w:tcMar>
-              <w:top w:w="85" w:type="dxa"/>
-              <w:left w:w="85" w:type="dxa"/>
-              <w:bottom w:w="85" w:type="dxa"/>
-              <w:right w:w="85" w:type="dxa"/>
-            </w:tcMar>
-          </w:tcPr>
-          <w:p>
-            <w:pPr>
-              <w:spacing w:after="20" w:line="250" w:lineRule="auto"/>
-            </w:pPr>
-            <w:r>
-              <w:rPr>
-                <w:b/>
-                <w:color w:val="FFFFFF"/>
-                <w:sz w:val="19"/>
-              </w:rPr>
-              <w:t>Coverage</w:t>
-            </w:r>
-          </w:p>
-        </w:tc>
-        <w:tc>
-          <w:tcPr>
-            <w:tcW w:type="dxa" w:w="7848"/>
-            <w:vAlign w:val="center"/>
-            <w:shd w:fill="233F55"/>
-            <w:tcMar>
-              <w:top w:w="85" w:type="dxa"/>
-              <w:left w:w="85" w:type="dxa"/>
-              <w:bottom w:w="85" w:type="dxa"/>
-              <w:right w:w="85" w:type="dxa"/>
-            </w:tcMar>
-          </w:tcPr>
-          <w:p>
-            <w:pPr>
-              <w:spacing w:after="20" w:line="250" w:lineRule="auto"/>
-            </w:pPr>
-            <w:r>
-              <w:rPr>
-                <w:b/>
-                <w:color w:val="FFFFFF"/>
-                <w:sz w:val="19"/>
-              </w:rPr>
-              <w:t>Evidence</w:t>
-            </w:r>
-          </w:p>
-        </w:tc>
-      </w:tr>
-      <w:tr>
-        <w:trPr>
-          <w:cantSplit/>
-        </w:trPr>
-        <w:tc>
-          <w:tcPr>
-            <w:tcW w:type="dxa" w:w="1872"/>
-            <w:vAlign w:val="center"/>
-            <w:shd w:fill="FFFFFF"/>
-            <w:tcMar>
-              <w:top w:w="85" w:type="dxa"/>
-              <w:left w:w="85" w:type="dxa"/>
-              <w:bottom w:w="85" w:type="dxa"/>
-              <w:right w:w="85" w:type="dxa"/>
-            </w:tcMar>
-          </w:tcPr>
-          <w:p>
-            <w:pPr>
-              <w:spacing w:after="20" w:line="250" w:lineRule="auto"/>
-            </w:pPr>
-            <w:r>
-              <w:rPr>
-                <w:sz w:val="19"/>
-              </w:rPr>
-              <w:t>Algorithms</w:t>
-            </w:r>
-          </w:p>
-        </w:tc>
-        <w:tc>
-          <w:tcPr>
-            <w:tcW w:type="dxa" w:w="7848"/>
-            <w:vAlign w:val="center"/>
-            <w:shd w:fill="FFFFFF"/>
-            <w:tcMar>
-              <w:top w:w="85" w:type="dxa"/>
-              <w:left w:w="85" w:type="dxa"/>
-              <w:bottom w:w="85" w:type="dxa"/>
-              <w:right w:w="85" w:type="dxa"/>
-            </w:tcMar>
-          </w:tcPr>
-          <w:p>
-            <w:pPr>
-              <w:spacing w:after="20" w:line="250" w:lineRule="auto"/>
-            </w:pPr>
-            <w:r>
-              <w:rPr>
-                <w:sz w:val="19"/>
-              </w:rPr>
-              <w:t>Positive, negative, decimal, and zero operands for all four strategies.</w:t>
-            </w:r>
-          </w:p>
-        </w:tc>
-      </w:tr>
-      <w:tr>
-        <w:trPr>
-          <w:cantSplit/>
-        </w:trPr>
-        <w:tc>
-          <w:tcPr>
-            <w:tcW w:type="dxa" w:w="1872"/>
-            <w:vAlign w:val="center"/>
-            <w:shd w:fill="F0F4F7"/>
-            <w:tcMar>
-              <w:top w:w="85" w:type="dxa"/>
-              <w:left w:w="85" w:type="dxa"/>
-              <w:bottom w:w="85" w:type="dxa"/>
-              <w:right w:w="85" w:type="dxa"/>
-            </w:tcMar>
-          </w:tcPr>
-          <w:p>
-            <w:pPr>
-              <w:spacing w:after="20" w:line="250" w:lineRule="auto"/>
-            </w:pPr>
-            <w:r>
-              <w:rPr>
-                <w:sz w:val="19"/>
-              </w:rPr>
-              <w:t>Context</w:t>
-            </w:r>
-          </w:p>
-        </w:tc>
-        <w:tc>
-          <w:tcPr>
-            <w:tcW w:type="dxa" w:w="7848"/>
-            <w:vAlign w:val="center"/>
-            <w:shd w:fill="F0F4F7"/>
-            <w:tcMar>
-              <w:top w:w="85" w:type="dxa"/>
-              <w:left w:w="85" w:type="dxa"/>
-              <w:bottom w:w="85" w:type="dxa"/>
-              <w:right w:w="85" w:type="dxa"/>
-            </w:tcMar>
-          </w:tcPr>
-          <w:p>
-            <w:pPr>
-              <w:spacing w:after="20" w:line="250" w:lineRule="auto"/>
-            </w:pPr>
-            <w:r>
-              <w:rPr>
-                <w:sz w:val="19"/>
-              </w:rPr>
-              <w:t>Runtime switching, custom injected algorithm, null rejection, previous strategy preserved.</w:t>
-            </w:r>
-          </w:p>
-        </w:tc>
-      </w:tr>
-      <w:tr>
-        <w:trPr>
-          <w:cantSplit/>
-        </w:trPr>
-        <w:tc>
-          <w:tcPr>
-            <w:tcW w:type="dxa" w:w="1872"/>
-            <w:vAlign w:val="center"/>
-            <w:shd w:fill="FFFFFF"/>
-            <w:tcMar>
-              <w:top w:w="85" w:type="dxa"/>
-              <w:left w:w="85" w:type="dxa"/>
-              <w:bottom w:w="85" w:type="dxa"/>
-              <w:right w:w="85" w:type="dxa"/>
-            </w:tcMar>
-          </w:tcPr>
-          <w:p>
-            <w:pPr>
-              <w:spacing w:after="20" w:line="250" w:lineRule="auto"/>
-            </w:pPr>
-            <w:r>
-              <w:rPr>
-                <w:sz w:val="19"/>
-              </w:rPr>
-              <w:t>Division</w:t>
-            </w:r>
-          </w:p>
-        </w:tc>
-        <w:tc>
-          <w:tcPr>
-            <w:tcW w:type="dxa" w:w="7848"/>
-            <w:vAlign w:val="center"/>
-            <w:shd w:fill="FFFFFF"/>
-            <w:tcMar>
-              <w:top w:w="85" w:type="dxa"/>
-              <w:left w:w="85" w:type="dxa"/>
-              <w:bottom w:w="85" w:type="dxa"/>
-              <w:right w:w="85" w:type="dxa"/>
-            </w:tcMar>
-          </w:tcPr>
-          <w:p>
-            <w:pPr>
-              <w:spacing w:after="20" w:line="250" w:lineRule="auto"/>
-            </w:pPr>
-            <w:r>
-              <w:rPr>
-                <w:sz w:val="19"/>
-              </w:rPr>
-              <w:t>Three representations of zero rejected; 1/3 rounded to the documented precision.</w:t>
-            </w:r>
-          </w:p>
-        </w:tc>
-      </w:tr>
-      <w:tr>
-        <w:trPr>
-          <w:cantSplit/>
-        </w:trPr>
-        <w:tc>
-          <w:tcPr>
-            <w:tcW w:type="dxa" w:w="1872"/>
-            <w:vAlign w:val="center"/>
-            <w:shd w:fill="F0F4F7"/>
-            <w:tcMar>
-              <w:top w:w="85" w:type="dxa"/>
-              <w:left w:w="85" w:type="dxa"/>
-              <w:bottom w:w="85" w:type="dxa"/>
-              <w:right w:w="85" w:type="dxa"/>
-            </w:tcMar>
-          </w:tcPr>
-          <w:p>
-            <w:pPr>
-              <w:spacing w:after="20" w:line="250" w:lineRule="auto"/>
-            </w:pPr>
-            <w:r>
-              <w:rPr>
-                <w:sz w:val="19"/>
-              </w:rPr>
-              <w:t>Execution</w:t>
-            </w:r>
-          </w:p>
-        </w:tc>
-        <w:tc>
-          <w:tcPr>
-            <w:tcW w:type="dxa" w:w="7848"/>
-            <w:vAlign w:val="center"/>
-            <w:shd w:fill="F0F4F7"/>
-            <w:tcMar>
-              <w:top w:w="85" w:type="dxa"/>
-              <w:left w:w="85" w:type="dxa"/>
-              <w:bottom w:w="85" w:type="dxa"/>
-              <w:right w:w="85" w:type="dxa"/>
-            </w:tcMar>
-          </w:tcPr>
-          <w:p>
-            <w:pPr>
-              <w:spacing w:after="20" w:line="250" w:lineRule="auto"/>
-            </w:pPr>
-            <w:r>
-              <w:rPr>
-                <w:sz w:val="19"/>
-              </w:rPr>
-              <w:t>Two matching JAR runs and the JDK-only Windows launcher.</w:t>
-            </w:r>
-          </w:p>
-        </w:tc>
-      </w:tr>
-      <w:tr>
-        <w:trPr>
-          <w:cantSplit/>
-        </w:trPr>
-        <w:tc>
-          <w:tcPr>
-            <w:tcW w:type="dxa" w:w="1872"/>
-            <w:vAlign w:val="center"/>
-            <w:shd w:fill="FFFFFF"/>
-            <w:tcMar>
-              <w:top w:w="85" w:type="dxa"/>
-              <w:left w:w="85" w:type="dxa"/>
-              <w:bottom w:w="85" w:type="dxa"/>
-              <w:right w:w="85" w:type="dxa"/>
-            </w:tcMar>
-          </w:tcPr>
-          <w:p>
-            <w:pPr>
-              <w:spacing w:after="20" w:line="250" w:lineRule="auto"/>
-            </w:pPr>
-            <w:r>
-              <w:rPr>
-                <w:sz w:val="19"/>
-              </w:rPr>
-              <w:t>Structure</w:t>
-            </w:r>
-          </w:p>
-        </w:tc>
-        <w:tc>
-          <w:tcPr>
-            <w:tcW w:type="dxa" w:w="7848"/>
-            <w:vAlign w:val="center"/>
-            <w:shd w:fill="FFFFFF"/>
-            <w:tcMar>
-              <w:top w:w="85" w:type="dxa"/>
-              <w:left w:w="85" w:type="dxa"/>
-              <w:bottom w:w="85" w:type="dxa"/>
-              <w:right w:w="85" w:type="dxa"/>
-            </w:tcMar>
-          </w:tcPr>
-          <w:p>
-            <w:pPr>
-              <w:spacing w:after="20" w:line="250" w:lineRule="auto"/>
-            </w:pPr>
-            <w:r>
-              <w:rPr>
-                <w:sz w:val="19"/>
-              </w:rPr>
-              <w:t>No algorithm selection branches or concrete strategy references inside Calculator.</w:t>
-            </w:r>
-          </w:p>
-        </w:tc>
-      </w:tr>
-    </w:tbl>
-    <w:p>
-      <w:pPr>
-        <w:spacing w:after="20"/>
-      </w:pPr>
-    </w:p>
-    <w:p>
-      <w:pPr>
-        <w:pStyle w:val="Heading1"/>
-      </w:pPr>
-      <w:r>
-        <w:t>5 Conclusion</w:t>
-      </w:r>
-    </w:p>
-    <w:p>
-      <w:r>
-        <w:t>Strategy moves each arithmetic algorithm into an interchangeable object. Runtime switching changes behavior without replacing the Calculator or editing its delegation logic. The cost is more small classes and explicit client configuration. For a tiny calculator a direct expression would be shorter; the separate classes make the variation point and extension behavior visible for this assignment. The context is mutable and intended for sequential use.</w:t>
+        <w:t>Strategy allows the calculation to change at runtime without editing Calculator. New algorithms can be added as strategy classes. This improves flexibility, but adds classes and requires the client to choose the strategy.</w:t>
       </w:r>
     </w:p>
     <w:p>
@@ -1136,2176 +295,16 @@
       </w:r>
     </w:p>
     <w:p>
-      <w:pPr>
-        <w:pStyle w:val="Heading2"/>
-      </w:pPr>
       <w:r>
-        <w:t>References</w:t>
-      </w:r>
-    </w:p>
-    <w:p>
-      <w:r>
-        <w:t>Robert C. Martin. Clean Code. 2008. Chapters 9, 10, and 11. Publisher contents: https://www.informit.com/store/clean-code-a-handbook-of-agile-software-craftsmanship-9780132350884</w:t>
-      </w:r>
-    </w:p>
-    <w:p>
-      <w:r>
-        <w:t>Assignment 5 Strategy Pattern Instructions and the supplied chapter requirement.</w:t>
-      </w:r>
-    </w:p>
-    <w:p>
-      <w:r>
-        <w:br w:type="page"/>
-      </w:r>
-    </w:p>
-    <w:p>
-      <w:pPr>
-        <w:pStyle w:val="Heading1"/>
-      </w:pPr>
-      <w:r>
-        <w:t>Appendix A Complete source register</w:t>
-      </w:r>
-    </w:p>
-    <w:p>
-      <w:r>
-        <w:t>The JDK compiler tree API extracted the declarations from all Java files under src. The table includes the strategy interface and both test classes. Interface calculate is implicitly public abstract; default constructors generated by Java are not explicit source declarations.</w:t>
-      </w:r>
-    </w:p>
-    <w:tbl>
-      <w:tblPr>
-        <w:tblW w:type="auto" w:w="0"/>
-        <w:jc w:val="center"/>
-        <w:tblLayout w:type="fixed"/>
-        <w:tblLook w:firstColumn="1" w:firstRow="1" w:lastColumn="0" w:lastRow="0" w:noHBand="0" w:noVBand="1" w:val="04A0"/>
-        <w:tblBorders>
-          <w:top w:val="single" w:sz="5" w:color="D9D9D9"/>
-          <w:left w:val="single" w:sz="5" w:color="D9D9D9"/>
-          <w:bottom w:val="single" w:sz="5" w:color="D9D9D9"/>
-          <w:right w:val="single" w:sz="5" w:color="D9D9D9"/>
-          <w:insideH w:val="single" w:sz="5" w:color="D9D9D9"/>
-          <w:insideV w:val="single" w:sz="5" w:color="D9D9D9"/>
-        </w:tblBorders>
-      </w:tblPr>
-      <w:tblGrid>
-        <w:gridCol w:w="3240"/>
-        <w:gridCol w:w="1512"/>
-        <w:gridCol w:w="1008"/>
-        <w:gridCol w:w="1224"/>
-        <w:gridCol w:w="2736"/>
-      </w:tblGrid>
-      <w:tr>
-        <w:trPr>
-          <w:cantSplit/>
-          <w:tblHeader/>
-        </w:trPr>
-        <w:tc>
-          <w:tcPr>
-            <w:tcW w:type="dxa" w:w="3240"/>
-            <w:vAlign w:val="center"/>
-            <w:shd w:fill="233F55"/>
-            <w:tcMar>
-              <w:top w:w="50" w:type="dxa"/>
-              <w:left w:w="85" w:type="dxa"/>
-              <w:bottom w:w="50" w:type="dxa"/>
-              <w:right w:w="85" w:type="dxa"/>
-            </w:tcMar>
-          </w:tcPr>
-          <w:p>
-            <w:pPr>
-              <w:spacing w:after="0" w:line="240" w:lineRule="auto"/>
-            </w:pPr>
-            <w:r>
-              <w:rPr>
-                <w:b/>
-                <w:color w:val="FFFFFF"/>
-                <w:sz w:val="18"/>
-              </w:rPr>
-              <w:t>Type</w:t>
-            </w:r>
-          </w:p>
-        </w:tc>
-        <w:tc>
-          <w:tcPr>
-            <w:tcW w:type="dxa" w:w="1512"/>
-            <w:vAlign w:val="center"/>
-            <w:shd w:fill="233F55"/>
-            <w:tcMar>
-              <w:top w:w="50" w:type="dxa"/>
-              <w:left w:w="85" w:type="dxa"/>
-              <w:bottom w:w="50" w:type="dxa"/>
-              <w:right w:w="85" w:type="dxa"/>
-            </w:tcMar>
-          </w:tcPr>
-          <w:p>
-            <w:pPr>
-              <w:spacing w:after="0" w:line="240" w:lineRule="auto"/>
-            </w:pPr>
-            <w:r>
-              <w:rPr>
-                <w:b/>
-                <w:color w:val="FFFFFF"/>
-                <w:sz w:val="18"/>
-              </w:rPr>
-              <w:t>Kind</w:t>
-            </w:r>
-          </w:p>
-        </w:tc>
-        <w:tc>
-          <w:tcPr>
-            <w:tcW w:type="dxa" w:w="1008"/>
-            <w:vAlign w:val="center"/>
-            <w:shd w:fill="233F55"/>
-            <w:tcMar>
-              <w:top w:w="50" w:type="dxa"/>
-              <w:left w:w="85" w:type="dxa"/>
-              <w:bottom w:w="50" w:type="dxa"/>
-              <w:right w:w="85" w:type="dxa"/>
-            </w:tcMar>
-          </w:tcPr>
-          <w:p>
-            <w:pPr>
-              <w:spacing w:after="0" w:line="240" w:lineRule="auto"/>
-            </w:pPr>
-            <w:r>
-              <w:rPr>
-                <w:b/>
-                <w:color w:val="FFFFFF"/>
-                <w:sz w:val="18"/>
-              </w:rPr>
-              <w:t>Fields</w:t>
-            </w:r>
-          </w:p>
-        </w:tc>
-        <w:tc>
-          <w:tcPr>
-            <w:tcW w:type="dxa" w:w="1224"/>
-            <w:vAlign w:val="center"/>
-            <w:shd w:fill="233F55"/>
-            <w:tcMar>
-              <w:top w:w="50" w:type="dxa"/>
-              <w:left w:w="85" w:type="dxa"/>
-              <w:bottom w:w="50" w:type="dxa"/>
-              <w:right w:w="85" w:type="dxa"/>
-            </w:tcMar>
-          </w:tcPr>
-          <w:p>
-            <w:pPr>
-              <w:spacing w:after="0" w:line="240" w:lineRule="auto"/>
-            </w:pPr>
-            <w:r>
-              <w:rPr>
-                <w:b/>
-                <w:color w:val="FFFFFF"/>
-                <w:sz w:val="18"/>
-              </w:rPr>
-              <w:t>Methods</w:t>
-            </w:r>
-          </w:p>
-        </w:tc>
-        <w:tc>
-          <w:tcPr>
-            <w:tcW w:type="dxa" w:w="2736"/>
-            <w:vAlign w:val="center"/>
-            <w:shd w:fill="233F55"/>
-            <w:tcMar>
-              <w:top w:w="50" w:type="dxa"/>
-              <w:left w:w="85" w:type="dxa"/>
-              <w:bottom w:w="50" w:type="dxa"/>
-              <w:right w:w="85" w:type="dxa"/>
-            </w:tcMar>
-          </w:tcPr>
-          <w:p>
-            <w:pPr>
-              <w:spacing w:after="0" w:line="240" w:lineRule="auto"/>
-            </w:pPr>
-            <w:r>
-              <w:rPr>
-                <w:b/>
-                <w:color w:val="FFFFFF"/>
-                <w:sz w:val="18"/>
-              </w:rPr>
-              <w:t>Constructors</w:t>
-            </w:r>
-          </w:p>
-        </w:tc>
-      </w:tr>
-      <w:tr>
-        <w:trPr>
-          <w:cantSplit/>
-        </w:trPr>
-        <w:tc>
-          <w:tcPr>
-            <w:tcW w:type="dxa" w:w="3240"/>
-            <w:vAlign w:val="center"/>
-            <w:shd w:fill="FFFFFF"/>
-            <w:tcMar>
-              <w:top w:w="50" w:type="dxa"/>
-              <w:left w:w="85" w:type="dxa"/>
-              <w:bottom w:w="50" w:type="dxa"/>
-              <w:right w:w="85" w:type="dxa"/>
-            </w:tcMar>
-          </w:tcPr>
-          <w:p>
-            <w:pPr>
-              <w:spacing w:after="0" w:line="240" w:lineRule="auto"/>
-            </w:pPr>
-            <w:r>
-              <w:rPr>
-                <w:sz w:val="18"/>
-              </w:rPr>
-              <w:t>AdditionStrategy</w:t>
-            </w:r>
-          </w:p>
-        </w:tc>
-        <w:tc>
-          <w:tcPr>
-            <w:tcW w:type="dxa" w:w="1512"/>
-            <w:vAlign w:val="center"/>
-            <w:shd w:fill="FFFFFF"/>
-            <w:tcMar>
-              <w:top w:w="50" w:type="dxa"/>
-              <w:left w:w="85" w:type="dxa"/>
-              <w:bottom w:w="50" w:type="dxa"/>
-              <w:right w:w="85" w:type="dxa"/>
-            </w:tcMar>
-          </w:tcPr>
-          <w:p>
-            <w:pPr>
-              <w:spacing w:after="0" w:line="240" w:lineRule="auto"/>
-            </w:pPr>
-            <w:r>
-              <w:rPr>
-                <w:sz w:val="18"/>
-              </w:rPr>
-              <w:t>class</w:t>
-            </w:r>
-          </w:p>
-        </w:tc>
-        <w:tc>
-          <w:tcPr>
-            <w:tcW w:type="dxa" w:w="1008"/>
-            <w:vAlign w:val="center"/>
-            <w:shd w:fill="FFFFFF"/>
-            <w:tcMar>
-              <w:top w:w="50" w:type="dxa"/>
-              <w:left w:w="85" w:type="dxa"/>
-              <w:bottom w:w="50" w:type="dxa"/>
-              <w:right w:w="85" w:type="dxa"/>
-            </w:tcMar>
-          </w:tcPr>
-          <w:p>
-            <w:pPr>
-              <w:spacing w:after="0" w:line="240" w:lineRule="auto"/>
-            </w:pPr>
-            <w:r>
-              <w:rPr>
-                <w:sz w:val="18"/>
-              </w:rPr>
-              <w:t>0</w:t>
-            </w:r>
-          </w:p>
-        </w:tc>
-        <w:tc>
-          <w:tcPr>
-            <w:tcW w:type="dxa" w:w="1224"/>
-            <w:vAlign w:val="center"/>
-            <w:shd w:fill="FFFFFF"/>
-            <w:tcMar>
-              <w:top w:w="50" w:type="dxa"/>
-              <w:left w:w="85" w:type="dxa"/>
-              <w:bottom w:w="50" w:type="dxa"/>
-              <w:right w:w="85" w:type="dxa"/>
-            </w:tcMar>
-          </w:tcPr>
-          <w:p>
-            <w:pPr>
-              <w:spacing w:after="0" w:line="240" w:lineRule="auto"/>
-            </w:pPr>
-            <w:r>
-              <w:rPr>
-                <w:sz w:val="18"/>
-              </w:rPr>
-              <w:t>1</w:t>
-            </w:r>
-          </w:p>
-        </w:tc>
-        <w:tc>
-          <w:tcPr>
-            <w:tcW w:type="dxa" w:w="2736"/>
-            <w:vAlign w:val="center"/>
-            <w:shd w:fill="FFFFFF"/>
-            <w:tcMar>
-              <w:top w:w="50" w:type="dxa"/>
-              <w:left w:w="85" w:type="dxa"/>
-              <w:bottom w:w="50" w:type="dxa"/>
-              <w:right w:w="85" w:type="dxa"/>
-            </w:tcMar>
-          </w:tcPr>
-          <w:p>
-            <w:pPr>
-              <w:spacing w:after="0" w:line="240" w:lineRule="auto"/>
-            </w:pPr>
-            <w:r>
-              <w:rPr>
-                <w:sz w:val="18"/>
-              </w:rPr>
-              <w:t>0</w:t>
-            </w:r>
-          </w:p>
-        </w:tc>
-      </w:tr>
-      <w:tr>
-        <w:trPr>
-          <w:cantSplit/>
-        </w:trPr>
-        <w:tc>
-          <w:tcPr>
-            <w:tcW w:type="dxa" w:w="3240"/>
-            <w:vAlign w:val="center"/>
-            <w:shd w:fill="F0F4F7"/>
-            <w:tcMar>
-              <w:top w:w="50" w:type="dxa"/>
-              <w:left w:w="85" w:type="dxa"/>
-              <w:bottom w:w="50" w:type="dxa"/>
-              <w:right w:w="85" w:type="dxa"/>
-            </w:tcMar>
-          </w:tcPr>
-          <w:p>
-            <w:pPr>
-              <w:spacing w:after="0" w:line="240" w:lineRule="auto"/>
-            </w:pPr>
-            <w:r>
-              <w:rPr>
-                <w:sz w:val="18"/>
-              </w:rPr>
-              <w:t>CalculationStrategy</w:t>
-            </w:r>
-          </w:p>
-        </w:tc>
-        <w:tc>
-          <w:tcPr>
-            <w:tcW w:type="dxa" w:w="1512"/>
-            <w:vAlign w:val="center"/>
-            <w:shd w:fill="F0F4F7"/>
-            <w:tcMar>
-              <w:top w:w="50" w:type="dxa"/>
-              <w:left w:w="85" w:type="dxa"/>
-              <w:bottom w:w="50" w:type="dxa"/>
-              <w:right w:w="85" w:type="dxa"/>
-            </w:tcMar>
-          </w:tcPr>
-          <w:p>
-            <w:pPr>
-              <w:spacing w:after="0" w:line="240" w:lineRule="auto"/>
-            </w:pPr>
-            <w:r>
-              <w:rPr>
-                <w:sz w:val="18"/>
-              </w:rPr>
-              <w:t>interface</w:t>
-            </w:r>
-          </w:p>
-        </w:tc>
-        <w:tc>
-          <w:tcPr>
-            <w:tcW w:type="dxa" w:w="1008"/>
-            <w:vAlign w:val="center"/>
-            <w:shd w:fill="F0F4F7"/>
-            <w:tcMar>
-              <w:top w:w="50" w:type="dxa"/>
-              <w:left w:w="85" w:type="dxa"/>
-              <w:bottom w:w="50" w:type="dxa"/>
-              <w:right w:w="85" w:type="dxa"/>
-            </w:tcMar>
-          </w:tcPr>
-          <w:p>
-            <w:pPr>
-              <w:spacing w:after="0" w:line="240" w:lineRule="auto"/>
-            </w:pPr>
-            <w:r>
-              <w:rPr>
-                <w:sz w:val="18"/>
-              </w:rPr>
-              <w:t>0</w:t>
-            </w:r>
-          </w:p>
-        </w:tc>
-        <w:tc>
-          <w:tcPr>
-            <w:tcW w:type="dxa" w:w="1224"/>
-            <w:vAlign w:val="center"/>
-            <w:shd w:fill="F0F4F7"/>
-            <w:tcMar>
-              <w:top w:w="50" w:type="dxa"/>
-              <w:left w:w="85" w:type="dxa"/>
-              <w:bottom w:w="50" w:type="dxa"/>
-              <w:right w:w="85" w:type="dxa"/>
-            </w:tcMar>
-          </w:tcPr>
-          <w:p>
-            <w:pPr>
-              <w:spacing w:after="0" w:line="240" w:lineRule="auto"/>
-            </w:pPr>
-            <w:r>
-              <w:rPr>
-                <w:sz w:val="18"/>
-              </w:rPr>
-              <w:t>1</w:t>
-            </w:r>
-          </w:p>
-        </w:tc>
-        <w:tc>
-          <w:tcPr>
-            <w:tcW w:type="dxa" w:w="2736"/>
-            <w:vAlign w:val="center"/>
-            <w:shd w:fill="F0F4F7"/>
-            <w:tcMar>
-              <w:top w:w="50" w:type="dxa"/>
-              <w:left w:w="85" w:type="dxa"/>
-              <w:bottom w:w="50" w:type="dxa"/>
-              <w:right w:w="85" w:type="dxa"/>
-            </w:tcMar>
-          </w:tcPr>
-          <w:p>
-            <w:pPr>
-              <w:spacing w:after="0" w:line="240" w:lineRule="auto"/>
-            </w:pPr>
-            <w:r>
-              <w:rPr>
-                <w:sz w:val="18"/>
-              </w:rPr>
-              <w:t>0</w:t>
-            </w:r>
-          </w:p>
-        </w:tc>
-      </w:tr>
-      <w:tr>
-        <w:trPr>
-          <w:cantSplit/>
-        </w:trPr>
-        <w:tc>
-          <w:tcPr>
-            <w:tcW w:type="dxa" w:w="3240"/>
-            <w:vAlign w:val="center"/>
-            <w:shd w:fill="FFFFFF"/>
-            <w:tcMar>
-              <w:top w:w="50" w:type="dxa"/>
-              <w:left w:w="85" w:type="dxa"/>
-              <w:bottom w:w="50" w:type="dxa"/>
-              <w:right w:w="85" w:type="dxa"/>
-            </w:tcMar>
-          </w:tcPr>
-          <w:p>
-            <w:pPr>
-              <w:spacing w:after="0" w:line="240" w:lineRule="auto"/>
-            </w:pPr>
-            <w:r>
-              <w:rPr>
-                <w:sz w:val="18"/>
-              </w:rPr>
-              <w:t>DivisionStrategy</w:t>
-            </w:r>
-          </w:p>
-        </w:tc>
-        <w:tc>
-          <w:tcPr>
-            <w:tcW w:type="dxa" w:w="1512"/>
-            <w:vAlign w:val="center"/>
-            <w:shd w:fill="FFFFFF"/>
-            <w:tcMar>
-              <w:top w:w="50" w:type="dxa"/>
-              <w:left w:w="85" w:type="dxa"/>
-              <w:bottom w:w="50" w:type="dxa"/>
-              <w:right w:w="85" w:type="dxa"/>
-            </w:tcMar>
-          </w:tcPr>
-          <w:p>
-            <w:pPr>
-              <w:spacing w:after="0" w:line="240" w:lineRule="auto"/>
-            </w:pPr>
-            <w:r>
-              <w:rPr>
-                <w:sz w:val="18"/>
-              </w:rPr>
-              <w:t>class</w:t>
-            </w:r>
-          </w:p>
-        </w:tc>
-        <w:tc>
-          <w:tcPr>
-            <w:tcW w:type="dxa" w:w="1008"/>
-            <w:vAlign w:val="center"/>
-            <w:shd w:fill="FFFFFF"/>
-            <w:tcMar>
-              <w:top w:w="50" w:type="dxa"/>
-              <w:left w:w="85" w:type="dxa"/>
-              <w:bottom w:w="50" w:type="dxa"/>
-              <w:right w:w="85" w:type="dxa"/>
-            </w:tcMar>
-          </w:tcPr>
-          <w:p>
-            <w:pPr>
-              <w:spacing w:after="0" w:line="240" w:lineRule="auto"/>
-            </w:pPr>
-            <w:r>
-              <w:rPr>
-                <w:sz w:val="18"/>
-              </w:rPr>
-              <w:t>0</w:t>
-            </w:r>
-          </w:p>
-        </w:tc>
-        <w:tc>
-          <w:tcPr>
-            <w:tcW w:type="dxa" w:w="1224"/>
-            <w:vAlign w:val="center"/>
-            <w:shd w:fill="FFFFFF"/>
-            <w:tcMar>
-              <w:top w:w="50" w:type="dxa"/>
-              <w:left w:w="85" w:type="dxa"/>
-              <w:bottom w:w="50" w:type="dxa"/>
-              <w:right w:w="85" w:type="dxa"/>
-            </w:tcMar>
-          </w:tcPr>
-          <w:p>
-            <w:pPr>
-              <w:spacing w:after="0" w:line="240" w:lineRule="auto"/>
-            </w:pPr>
-            <w:r>
-              <w:rPr>
-                <w:sz w:val="18"/>
-              </w:rPr>
-              <w:t>1</w:t>
-            </w:r>
-          </w:p>
-        </w:tc>
-        <w:tc>
-          <w:tcPr>
-            <w:tcW w:type="dxa" w:w="2736"/>
-            <w:vAlign w:val="center"/>
-            <w:shd w:fill="FFFFFF"/>
-            <w:tcMar>
-              <w:top w:w="50" w:type="dxa"/>
-              <w:left w:w="85" w:type="dxa"/>
-              <w:bottom w:w="50" w:type="dxa"/>
-              <w:right w:w="85" w:type="dxa"/>
-            </w:tcMar>
-          </w:tcPr>
-          <w:p>
-            <w:pPr>
-              <w:spacing w:after="0" w:line="240" w:lineRule="auto"/>
-            </w:pPr>
-            <w:r>
-              <w:rPr>
-                <w:sz w:val="18"/>
-              </w:rPr>
-              <w:t>0</w:t>
-            </w:r>
-          </w:p>
-        </w:tc>
-      </w:tr>
-      <w:tr>
-        <w:trPr>
-          <w:cantSplit/>
-        </w:trPr>
-        <w:tc>
-          <w:tcPr>
-            <w:tcW w:type="dxa" w:w="3240"/>
-            <w:vAlign w:val="center"/>
-            <w:shd w:fill="F0F4F7"/>
-            <w:tcMar>
-              <w:top w:w="50" w:type="dxa"/>
-              <w:left w:w="85" w:type="dxa"/>
-              <w:bottom w:w="50" w:type="dxa"/>
-              <w:right w:w="85" w:type="dxa"/>
-            </w:tcMar>
-          </w:tcPr>
-          <w:p>
-            <w:pPr>
-              <w:spacing w:after="0" w:line="240" w:lineRule="auto"/>
-            </w:pPr>
-            <w:r>
-              <w:rPr>
-                <w:sz w:val="18"/>
-              </w:rPr>
-              <w:t>MultiplicationStrategy</w:t>
-            </w:r>
-          </w:p>
-        </w:tc>
-        <w:tc>
-          <w:tcPr>
-            <w:tcW w:type="dxa" w:w="1512"/>
-            <w:vAlign w:val="center"/>
-            <w:shd w:fill="F0F4F7"/>
-            <w:tcMar>
-              <w:top w:w="50" w:type="dxa"/>
-              <w:left w:w="85" w:type="dxa"/>
-              <w:bottom w:w="50" w:type="dxa"/>
-              <w:right w:w="85" w:type="dxa"/>
-            </w:tcMar>
-          </w:tcPr>
-          <w:p>
-            <w:pPr>
-              <w:spacing w:after="0" w:line="240" w:lineRule="auto"/>
-            </w:pPr>
-            <w:r>
-              <w:rPr>
-                <w:sz w:val="18"/>
-              </w:rPr>
-              <w:t>class</w:t>
-            </w:r>
-          </w:p>
-        </w:tc>
-        <w:tc>
-          <w:tcPr>
-            <w:tcW w:type="dxa" w:w="1008"/>
-            <w:vAlign w:val="center"/>
-            <w:shd w:fill="F0F4F7"/>
-            <w:tcMar>
-              <w:top w:w="50" w:type="dxa"/>
-              <w:left w:w="85" w:type="dxa"/>
-              <w:bottom w:w="50" w:type="dxa"/>
-              <w:right w:w="85" w:type="dxa"/>
-            </w:tcMar>
-          </w:tcPr>
-          <w:p>
-            <w:pPr>
-              <w:spacing w:after="0" w:line="240" w:lineRule="auto"/>
-            </w:pPr>
-            <w:r>
-              <w:rPr>
-                <w:sz w:val="18"/>
-              </w:rPr>
-              <w:t>0</w:t>
-            </w:r>
-          </w:p>
-        </w:tc>
-        <w:tc>
-          <w:tcPr>
-            <w:tcW w:type="dxa" w:w="1224"/>
-            <w:vAlign w:val="center"/>
-            <w:shd w:fill="F0F4F7"/>
-            <w:tcMar>
-              <w:top w:w="50" w:type="dxa"/>
-              <w:left w:w="85" w:type="dxa"/>
-              <w:bottom w:w="50" w:type="dxa"/>
-              <w:right w:w="85" w:type="dxa"/>
-            </w:tcMar>
-          </w:tcPr>
-          <w:p>
-            <w:pPr>
-              <w:spacing w:after="0" w:line="240" w:lineRule="auto"/>
-            </w:pPr>
-            <w:r>
-              <w:rPr>
-                <w:sz w:val="18"/>
-              </w:rPr>
-              <w:t>1</w:t>
-            </w:r>
-          </w:p>
-        </w:tc>
-        <w:tc>
-          <w:tcPr>
-            <w:tcW w:type="dxa" w:w="2736"/>
-            <w:vAlign w:val="center"/>
-            <w:shd w:fill="F0F4F7"/>
-            <w:tcMar>
-              <w:top w:w="50" w:type="dxa"/>
-              <w:left w:w="85" w:type="dxa"/>
-              <w:bottom w:w="50" w:type="dxa"/>
-              <w:right w:w="85" w:type="dxa"/>
-            </w:tcMar>
-          </w:tcPr>
-          <w:p>
-            <w:pPr>
-              <w:spacing w:after="0" w:line="240" w:lineRule="auto"/>
-            </w:pPr>
-            <w:r>
-              <w:rPr>
-                <w:sz w:val="18"/>
-              </w:rPr>
-              <w:t>0</w:t>
-            </w:r>
-          </w:p>
-        </w:tc>
-      </w:tr>
-      <w:tr>
-        <w:trPr>
-          <w:cantSplit/>
-        </w:trPr>
-        <w:tc>
-          <w:tcPr>
-            <w:tcW w:type="dxa" w:w="3240"/>
-            <w:vAlign w:val="center"/>
-            <w:shd w:fill="FFFFFF"/>
-            <w:tcMar>
-              <w:top w:w="50" w:type="dxa"/>
-              <w:left w:w="85" w:type="dxa"/>
-              <w:bottom w:w="50" w:type="dxa"/>
-              <w:right w:w="85" w:type="dxa"/>
-            </w:tcMar>
-          </w:tcPr>
-          <w:p>
-            <w:pPr>
-              <w:spacing w:after="0" w:line="240" w:lineRule="auto"/>
-            </w:pPr>
-            <w:r>
-              <w:rPr>
-                <w:sz w:val="18"/>
-              </w:rPr>
-              <w:t>SubtractionStrategy</w:t>
-            </w:r>
-          </w:p>
-        </w:tc>
-        <w:tc>
-          <w:tcPr>
-            <w:tcW w:type="dxa" w:w="1512"/>
-            <w:vAlign w:val="center"/>
-            <w:shd w:fill="FFFFFF"/>
-            <w:tcMar>
-              <w:top w:w="50" w:type="dxa"/>
-              <w:left w:w="85" w:type="dxa"/>
-              <w:bottom w:w="50" w:type="dxa"/>
-              <w:right w:w="85" w:type="dxa"/>
-            </w:tcMar>
-          </w:tcPr>
-          <w:p>
-            <w:pPr>
-              <w:spacing w:after="0" w:line="240" w:lineRule="auto"/>
-            </w:pPr>
-            <w:r>
-              <w:rPr>
-                <w:sz w:val="18"/>
-              </w:rPr>
-              <w:t>class</w:t>
-            </w:r>
-          </w:p>
-        </w:tc>
-        <w:tc>
-          <w:tcPr>
-            <w:tcW w:type="dxa" w:w="1008"/>
-            <w:vAlign w:val="center"/>
-            <w:shd w:fill="FFFFFF"/>
-            <w:tcMar>
-              <w:top w:w="50" w:type="dxa"/>
-              <w:left w:w="85" w:type="dxa"/>
-              <w:bottom w:w="50" w:type="dxa"/>
-              <w:right w:w="85" w:type="dxa"/>
-            </w:tcMar>
-          </w:tcPr>
-          <w:p>
-            <w:pPr>
-              <w:spacing w:after="0" w:line="240" w:lineRule="auto"/>
-            </w:pPr>
-            <w:r>
-              <w:rPr>
-                <w:sz w:val="18"/>
-              </w:rPr>
-              <w:t>0</w:t>
-            </w:r>
-          </w:p>
-        </w:tc>
-        <w:tc>
-          <w:tcPr>
-            <w:tcW w:type="dxa" w:w="1224"/>
-            <w:vAlign w:val="center"/>
-            <w:shd w:fill="FFFFFF"/>
-            <w:tcMar>
-              <w:top w:w="50" w:type="dxa"/>
-              <w:left w:w="85" w:type="dxa"/>
-              <w:bottom w:w="50" w:type="dxa"/>
-              <w:right w:w="85" w:type="dxa"/>
-            </w:tcMar>
-          </w:tcPr>
-          <w:p>
-            <w:pPr>
-              <w:spacing w:after="0" w:line="240" w:lineRule="auto"/>
-            </w:pPr>
-            <w:r>
-              <w:rPr>
-                <w:sz w:val="18"/>
-              </w:rPr>
-              <w:t>1</w:t>
-            </w:r>
-          </w:p>
-        </w:tc>
-        <w:tc>
-          <w:tcPr>
-            <w:tcW w:type="dxa" w:w="2736"/>
-            <w:vAlign w:val="center"/>
-            <w:shd w:fill="FFFFFF"/>
-            <w:tcMar>
-              <w:top w:w="50" w:type="dxa"/>
-              <w:left w:w="85" w:type="dxa"/>
-              <w:bottom w:w="50" w:type="dxa"/>
-              <w:right w:w="85" w:type="dxa"/>
-            </w:tcMar>
-          </w:tcPr>
-          <w:p>
-            <w:pPr>
-              <w:spacing w:after="0" w:line="240" w:lineRule="auto"/>
-            </w:pPr>
-            <w:r>
-              <w:rPr>
-                <w:sz w:val="18"/>
-              </w:rPr>
-              <w:t>0</w:t>
-            </w:r>
-          </w:p>
-        </w:tc>
-      </w:tr>
-      <w:tr>
-        <w:trPr>
-          <w:cantSplit/>
-        </w:trPr>
-        <w:tc>
-          <w:tcPr>
-            <w:tcW w:type="dxa" w:w="3240"/>
-            <w:vAlign w:val="center"/>
-            <w:shd w:fill="F0F4F7"/>
-            <w:tcMar>
-              <w:top w:w="50" w:type="dxa"/>
-              <w:left w:w="85" w:type="dxa"/>
-              <w:bottom w:w="50" w:type="dxa"/>
-              <w:right w:w="85" w:type="dxa"/>
-            </w:tcMar>
-          </w:tcPr>
-          <w:p>
-            <w:pPr>
-              <w:spacing w:after="0" w:line="240" w:lineRule="auto"/>
-            </w:pPr>
-            <w:r>
-              <w:rPr>
-                <w:sz w:val="18"/>
-              </w:rPr>
-              <w:t>CalculatorDemo</w:t>
-            </w:r>
-          </w:p>
-        </w:tc>
-        <w:tc>
-          <w:tcPr>
-            <w:tcW w:type="dxa" w:w="1512"/>
-            <w:vAlign w:val="center"/>
-            <w:shd w:fill="F0F4F7"/>
-            <w:tcMar>
-              <w:top w:w="50" w:type="dxa"/>
-              <w:left w:w="85" w:type="dxa"/>
-              <w:bottom w:w="50" w:type="dxa"/>
-              <w:right w:w="85" w:type="dxa"/>
-            </w:tcMar>
-          </w:tcPr>
-          <w:p>
-            <w:pPr>
-              <w:spacing w:after="0" w:line="240" w:lineRule="auto"/>
-            </w:pPr>
-            <w:r>
-              <w:rPr>
-                <w:sz w:val="18"/>
-              </w:rPr>
-              <w:t>class</w:t>
-            </w:r>
-          </w:p>
-        </w:tc>
-        <w:tc>
-          <w:tcPr>
-            <w:tcW w:type="dxa" w:w="1008"/>
-            <w:vAlign w:val="center"/>
-            <w:shd w:fill="F0F4F7"/>
-            <w:tcMar>
-              <w:top w:w="50" w:type="dxa"/>
-              <w:left w:w="85" w:type="dxa"/>
-              <w:bottom w:w="50" w:type="dxa"/>
-              <w:right w:w="85" w:type="dxa"/>
-            </w:tcMar>
-          </w:tcPr>
-          <w:p>
-            <w:pPr>
-              <w:spacing w:after="0" w:line="240" w:lineRule="auto"/>
-            </w:pPr>
-            <w:r>
-              <w:rPr>
-                <w:sz w:val="18"/>
-              </w:rPr>
-              <w:t>0</w:t>
-            </w:r>
-          </w:p>
-        </w:tc>
-        <w:tc>
-          <w:tcPr>
-            <w:tcW w:type="dxa" w:w="1224"/>
-            <w:vAlign w:val="center"/>
-            <w:shd w:fill="F0F4F7"/>
-            <w:tcMar>
-              <w:top w:w="50" w:type="dxa"/>
-              <w:left w:w="85" w:type="dxa"/>
-              <w:bottom w:w="50" w:type="dxa"/>
-              <w:right w:w="85" w:type="dxa"/>
-            </w:tcMar>
-          </w:tcPr>
-          <w:p>
-            <w:pPr>
-              <w:spacing w:after="0" w:line="240" w:lineRule="auto"/>
-            </w:pPr>
-            <w:r>
-              <w:rPr>
-                <w:sz w:val="18"/>
-              </w:rPr>
-              <w:t>2</w:t>
-            </w:r>
-          </w:p>
-        </w:tc>
-        <w:tc>
-          <w:tcPr>
-            <w:tcW w:type="dxa" w:w="2736"/>
-            <w:vAlign w:val="center"/>
-            <w:shd w:fill="F0F4F7"/>
-            <w:tcMar>
-              <w:top w:w="50" w:type="dxa"/>
-              <w:left w:w="85" w:type="dxa"/>
-              <w:bottom w:w="50" w:type="dxa"/>
-              <w:right w:w="85" w:type="dxa"/>
-            </w:tcMar>
-          </w:tcPr>
-          <w:p>
-            <w:pPr>
-              <w:spacing w:after="0" w:line="240" w:lineRule="auto"/>
-            </w:pPr>
-            <w:r>
-              <w:rPr>
-                <w:sz w:val="18"/>
-              </w:rPr>
-              <w:t>1</w:t>
-            </w:r>
-          </w:p>
-        </w:tc>
-      </w:tr>
-      <w:tr>
-        <w:trPr>
-          <w:cantSplit/>
-        </w:trPr>
-        <w:tc>
-          <w:tcPr>
-            <w:tcW w:type="dxa" w:w="3240"/>
-            <w:vAlign w:val="center"/>
-            <w:shd w:fill="FFFFFF"/>
-            <w:tcMar>
-              <w:top w:w="50" w:type="dxa"/>
-              <w:left w:w="85" w:type="dxa"/>
-              <w:bottom w:w="50" w:type="dxa"/>
-              <w:right w:w="85" w:type="dxa"/>
-            </w:tcMar>
-          </w:tcPr>
-          <w:p>
-            <w:pPr>
-              <w:spacing w:after="0" w:line="240" w:lineRule="auto"/>
-            </w:pPr>
-            <w:r>
-              <w:rPr>
-                <w:sz w:val="18"/>
-              </w:rPr>
-              <w:t>Calculator</w:t>
-            </w:r>
-          </w:p>
-        </w:tc>
-        <w:tc>
-          <w:tcPr>
-            <w:tcW w:type="dxa" w:w="1512"/>
-            <w:vAlign w:val="center"/>
-            <w:shd w:fill="FFFFFF"/>
-            <w:tcMar>
-              <w:top w:w="50" w:type="dxa"/>
-              <w:left w:w="85" w:type="dxa"/>
-              <w:bottom w:w="50" w:type="dxa"/>
-              <w:right w:w="85" w:type="dxa"/>
-            </w:tcMar>
-          </w:tcPr>
-          <w:p>
-            <w:pPr>
-              <w:spacing w:after="0" w:line="240" w:lineRule="auto"/>
-            </w:pPr>
-            <w:r>
-              <w:rPr>
-                <w:sz w:val="18"/>
-              </w:rPr>
-              <w:t>class</w:t>
-            </w:r>
-          </w:p>
-        </w:tc>
-        <w:tc>
-          <w:tcPr>
-            <w:tcW w:type="dxa" w:w="1008"/>
-            <w:vAlign w:val="center"/>
-            <w:shd w:fill="FFFFFF"/>
-            <w:tcMar>
-              <w:top w:w="50" w:type="dxa"/>
-              <w:left w:w="85" w:type="dxa"/>
-              <w:bottom w:w="50" w:type="dxa"/>
-              <w:right w:w="85" w:type="dxa"/>
-            </w:tcMar>
-          </w:tcPr>
-          <w:p>
-            <w:pPr>
-              <w:spacing w:after="0" w:line="240" w:lineRule="auto"/>
-            </w:pPr>
-            <w:r>
-              <w:rPr>
-                <w:sz w:val="18"/>
-              </w:rPr>
-              <w:t>1</w:t>
-            </w:r>
-          </w:p>
-        </w:tc>
-        <w:tc>
-          <w:tcPr>
-            <w:tcW w:type="dxa" w:w="1224"/>
-            <w:vAlign w:val="center"/>
-            <w:shd w:fill="FFFFFF"/>
-            <w:tcMar>
-              <w:top w:w="50" w:type="dxa"/>
-              <w:left w:w="85" w:type="dxa"/>
-              <w:bottom w:w="50" w:type="dxa"/>
-              <w:right w:w="85" w:type="dxa"/>
-            </w:tcMar>
-          </w:tcPr>
-          <w:p>
-            <w:pPr>
-              <w:spacing w:after="0" w:line="240" w:lineRule="auto"/>
-            </w:pPr>
-            <w:r>
-              <w:rPr>
-                <w:sz w:val="18"/>
-              </w:rPr>
-              <w:t>2</w:t>
-            </w:r>
-          </w:p>
-        </w:tc>
-        <w:tc>
-          <w:tcPr>
-            <w:tcW w:type="dxa" w:w="2736"/>
-            <w:vAlign w:val="center"/>
-            <w:shd w:fill="FFFFFF"/>
-            <w:tcMar>
-              <w:top w:w="50" w:type="dxa"/>
-              <w:left w:w="85" w:type="dxa"/>
-              <w:bottom w:w="50" w:type="dxa"/>
-              <w:right w:w="85" w:type="dxa"/>
-            </w:tcMar>
-          </w:tcPr>
-          <w:p>
-            <w:pPr>
-              <w:spacing w:after="0" w:line="240" w:lineRule="auto"/>
-            </w:pPr>
-            <w:r>
-              <w:rPr>
-                <w:sz w:val="18"/>
-              </w:rPr>
-              <w:t>1</w:t>
-            </w:r>
-          </w:p>
-        </w:tc>
-      </w:tr>
-      <w:tr>
-        <w:trPr>
-          <w:cantSplit/>
-        </w:trPr>
-        <w:tc>
-          <w:tcPr>
-            <w:tcW w:type="dxa" w:w="3240"/>
-            <w:vAlign w:val="center"/>
-            <w:shd w:fill="F0F4F7"/>
-            <w:tcMar>
-              <w:top w:w="50" w:type="dxa"/>
-              <w:left w:w="85" w:type="dxa"/>
-              <w:bottom w:w="50" w:type="dxa"/>
-              <w:right w:w="85" w:type="dxa"/>
-            </w:tcMar>
-          </w:tcPr>
-          <w:p>
-            <w:pPr>
-              <w:spacing w:after="0" w:line="240" w:lineRule="auto"/>
-            </w:pPr>
-            <w:r>
-              <w:rPr>
-                <w:sz w:val="18"/>
-              </w:rPr>
-              <w:t>CalculatorTest</w:t>
-            </w:r>
-          </w:p>
-        </w:tc>
-        <w:tc>
-          <w:tcPr>
-            <w:tcW w:type="dxa" w:w="1512"/>
-            <w:vAlign w:val="center"/>
-            <w:shd w:fill="F0F4F7"/>
-            <w:tcMar>
-              <w:top w:w="50" w:type="dxa"/>
-              <w:left w:w="85" w:type="dxa"/>
-              <w:bottom w:w="50" w:type="dxa"/>
-              <w:right w:w="85" w:type="dxa"/>
-            </w:tcMar>
-          </w:tcPr>
-          <w:p>
-            <w:pPr>
-              <w:spacing w:after="0" w:line="240" w:lineRule="auto"/>
-            </w:pPr>
-            <w:r>
-              <w:rPr>
-                <w:sz w:val="18"/>
-              </w:rPr>
-              <w:t>class</w:t>
-            </w:r>
-          </w:p>
-        </w:tc>
-        <w:tc>
-          <w:tcPr>
-            <w:tcW w:type="dxa" w:w="1008"/>
-            <w:vAlign w:val="center"/>
-            <w:shd w:fill="F0F4F7"/>
-            <w:tcMar>
-              <w:top w:w="50" w:type="dxa"/>
-              <w:left w:w="85" w:type="dxa"/>
-              <w:bottom w:w="50" w:type="dxa"/>
-              <w:right w:w="85" w:type="dxa"/>
-            </w:tcMar>
-          </w:tcPr>
-          <w:p>
-            <w:pPr>
-              <w:spacing w:after="0" w:line="240" w:lineRule="auto"/>
-            </w:pPr>
-            <w:r>
-              <w:rPr>
-                <w:sz w:val="18"/>
-              </w:rPr>
-              <w:t>0</w:t>
-            </w:r>
-          </w:p>
-        </w:tc>
-        <w:tc>
-          <w:tcPr>
-            <w:tcW w:type="dxa" w:w="1224"/>
-            <w:vAlign w:val="center"/>
-            <w:shd w:fill="F0F4F7"/>
-            <w:tcMar>
-              <w:top w:w="50" w:type="dxa"/>
-              <w:left w:w="85" w:type="dxa"/>
-              <w:bottom w:w="50" w:type="dxa"/>
-              <w:right w:w="85" w:type="dxa"/>
-            </w:tcMar>
-          </w:tcPr>
-          <w:p>
-            <w:pPr>
-              <w:spacing w:after="0" w:line="240" w:lineRule="auto"/>
-            </w:pPr>
-            <w:r>
-              <w:rPr>
-                <w:sz w:val="18"/>
-              </w:rPr>
-              <w:t>8</w:t>
-            </w:r>
-          </w:p>
-        </w:tc>
-        <w:tc>
-          <w:tcPr>
-            <w:tcW w:type="dxa" w:w="2736"/>
-            <w:vAlign w:val="center"/>
-            <w:shd w:fill="F0F4F7"/>
-            <w:tcMar>
-              <w:top w:w="50" w:type="dxa"/>
-              <w:left w:w="85" w:type="dxa"/>
-              <w:bottom w:w="50" w:type="dxa"/>
-              <w:right w:w="85" w:type="dxa"/>
-            </w:tcMar>
-          </w:tcPr>
-          <w:p>
-            <w:pPr>
-              <w:spacing w:after="0" w:line="240" w:lineRule="auto"/>
-            </w:pPr>
-            <w:r>
-              <w:rPr>
-                <w:sz w:val="18"/>
-              </w:rPr>
-              <w:t>0</w:t>
-            </w:r>
-          </w:p>
-        </w:tc>
-      </w:tr>
-      <w:tr>
-        <w:trPr>
-          <w:cantSplit/>
-        </w:trPr>
-        <w:tc>
-          <w:tcPr>
-            <w:tcW w:type="dxa" w:w="3240"/>
-            <w:vAlign w:val="center"/>
-            <w:shd w:fill="FFFFFF"/>
-            <w:tcMar>
-              <w:top w:w="50" w:type="dxa"/>
-              <w:left w:w="85" w:type="dxa"/>
-              <w:bottom w:w="50" w:type="dxa"/>
-              <w:right w:w="85" w:type="dxa"/>
-            </w:tcMar>
-          </w:tcPr>
-          <w:p>
-            <w:pPr>
-              <w:spacing w:after="0" w:line="240" w:lineRule="auto"/>
-            </w:pPr>
-            <w:r>
-              <w:rPr>
-                <w:sz w:val="18"/>
-              </w:rPr>
-              <w:t>StrategyTest</w:t>
-            </w:r>
-          </w:p>
-        </w:tc>
-        <w:tc>
-          <w:tcPr>
-            <w:tcW w:type="dxa" w:w="1512"/>
-            <w:vAlign w:val="center"/>
-            <w:shd w:fill="FFFFFF"/>
-            <w:tcMar>
-              <w:top w:w="50" w:type="dxa"/>
-              <w:left w:w="85" w:type="dxa"/>
-              <w:bottom w:w="50" w:type="dxa"/>
-              <w:right w:w="85" w:type="dxa"/>
-            </w:tcMar>
-          </w:tcPr>
-          <w:p>
-            <w:pPr>
-              <w:spacing w:after="0" w:line="240" w:lineRule="auto"/>
-            </w:pPr>
-            <w:r>
-              <w:rPr>
-                <w:sz w:val="18"/>
-              </w:rPr>
-              <w:t>class</w:t>
-            </w:r>
-          </w:p>
-        </w:tc>
-        <w:tc>
-          <w:tcPr>
-            <w:tcW w:type="dxa" w:w="1008"/>
-            <w:vAlign w:val="center"/>
-            <w:shd w:fill="FFFFFF"/>
-            <w:tcMar>
-              <w:top w:w="50" w:type="dxa"/>
-              <w:left w:w="85" w:type="dxa"/>
-              <w:bottom w:w="50" w:type="dxa"/>
-              <w:right w:w="85" w:type="dxa"/>
-            </w:tcMar>
-          </w:tcPr>
-          <w:p>
-            <w:pPr>
-              <w:spacing w:after="0" w:line="240" w:lineRule="auto"/>
-            </w:pPr>
-            <w:r>
-              <w:rPr>
-                <w:sz w:val="18"/>
-              </w:rPr>
-              <w:t>0</w:t>
-            </w:r>
-          </w:p>
-        </w:tc>
-        <w:tc>
-          <w:tcPr>
-            <w:tcW w:type="dxa" w:w="1224"/>
-            <w:vAlign w:val="center"/>
-            <w:shd w:fill="FFFFFF"/>
-            <w:tcMar>
-              <w:top w:w="50" w:type="dxa"/>
-              <w:left w:w="85" w:type="dxa"/>
-              <w:bottom w:w="50" w:type="dxa"/>
-              <w:right w:w="85" w:type="dxa"/>
-            </w:tcMar>
-          </w:tcPr>
-          <w:p>
-            <w:pPr>
-              <w:spacing w:after="0" w:line="240" w:lineRule="auto"/>
-            </w:pPr>
-            <w:r>
-              <w:rPr>
-                <w:sz w:val="18"/>
-              </w:rPr>
-              <w:t>6</w:t>
-            </w:r>
-          </w:p>
-        </w:tc>
-        <w:tc>
-          <w:tcPr>
-            <w:tcW w:type="dxa" w:w="2736"/>
-            <w:vAlign w:val="center"/>
-            <w:shd w:fill="FFFFFF"/>
-            <w:tcMar>
-              <w:top w:w="50" w:type="dxa"/>
-              <w:left w:w="85" w:type="dxa"/>
-              <w:bottom w:w="50" w:type="dxa"/>
-              <w:right w:w="85" w:type="dxa"/>
-            </w:tcMar>
-          </w:tcPr>
-          <w:p>
-            <w:pPr>
-              <w:spacing w:after="0" w:line="240" w:lineRule="auto"/>
-            </w:pPr>
-            <w:r>
-              <w:rPr>
-                <w:sz w:val="18"/>
-              </w:rPr>
-              <w:t>0</w:t>
-            </w:r>
-          </w:p>
-        </w:tc>
-      </w:tr>
-    </w:tbl>
-    <w:p>
-      <w:pPr>
-        <w:spacing w:after="20"/>
-      </w:pPr>
-    </w:p>
-    <w:p>
-      <w:pPr>
-        <w:pStyle w:val="Heading2"/>
-      </w:pPr>
-      <w:r>
-        <w:t>Local variable register</w:t>
-      </w:r>
-    </w:p>
-    <w:p>
-      <w:r>
-        <w:t>These are all 25 method-local and lambda parameter declarations. Regular method parameters already appear in UML signatures. Inferred lambda types are identified. The source inventory also records method annotations, paths, line numbers, and SHA-256 hashes.</w:t>
-      </w:r>
-    </w:p>
-    <w:tbl>
-      <w:tblPr>
-        <w:tblW w:type="auto" w:w="0"/>
-        <w:jc w:val="center"/>
-        <w:tblLayout w:type="fixed"/>
-        <w:tblLook w:firstColumn="1" w:firstRow="1" w:lastColumn="0" w:lastRow="0" w:noHBand="0" w:noVBand="1" w:val="04A0"/>
-        <w:tblBorders>
-          <w:top w:val="single" w:sz="5" w:color="D9D9D9"/>
-          <w:left w:val="single" w:sz="5" w:color="D9D9D9"/>
-          <w:bottom w:val="single" w:sz="5" w:color="D9D9D9"/>
-          <w:right w:val="single" w:sz="5" w:color="D9D9D9"/>
-          <w:insideH w:val="single" w:sz="5" w:color="D9D9D9"/>
-          <w:insideV w:val="single" w:sz="5" w:color="D9D9D9"/>
-        </w:tblBorders>
-      </w:tblPr>
-      <w:tblGrid>
-        <w:gridCol w:w="5832"/>
-        <w:gridCol w:w="3888"/>
-      </w:tblGrid>
-      <w:tr>
-        <w:trPr>
-          <w:cantSplit/>
-          <w:tblHeader/>
-        </w:trPr>
-        <w:tc>
-          <w:tcPr>
-            <w:tcW w:type="dxa" w:w="5832"/>
-            <w:vAlign w:val="center"/>
-            <w:shd w:fill="233F55"/>
-            <w:tcMar>
-              <w:top w:w="50" w:type="dxa"/>
-              <w:left w:w="85" w:type="dxa"/>
-              <w:bottom w:w="50" w:type="dxa"/>
-              <w:right w:w="85" w:type="dxa"/>
-            </w:tcMar>
-          </w:tcPr>
-          <w:p>
-            <w:pPr>
-              <w:spacing w:after="0" w:line="240" w:lineRule="auto"/>
-            </w:pPr>
-            <w:r>
-              <w:rPr>
-                <w:b/>
-                <w:color w:val="FFFFFF"/>
-                <w:sz w:val="18"/>
-              </w:rPr>
-              <w:t>Class and method</w:t>
-            </w:r>
-          </w:p>
-        </w:tc>
-        <w:tc>
-          <w:tcPr>
-            <w:tcW w:type="dxa" w:w="3888"/>
-            <w:vAlign w:val="center"/>
-            <w:shd w:fill="233F55"/>
-            <w:tcMar>
-              <w:top w:w="50" w:type="dxa"/>
-              <w:left w:w="85" w:type="dxa"/>
-              <w:bottom w:w="50" w:type="dxa"/>
-              <w:right w:w="85" w:type="dxa"/>
-            </w:tcMar>
-          </w:tcPr>
-          <w:p>
-            <w:pPr>
-              <w:spacing w:after="0" w:line="240" w:lineRule="auto"/>
-            </w:pPr>
-            <w:r>
-              <w:rPr>
-                <w:b/>
-                <w:color w:val="FFFFFF"/>
-                <w:sz w:val="18"/>
-              </w:rPr>
-              <w:t>Local declarations</w:t>
-            </w:r>
-          </w:p>
-        </w:tc>
-      </w:tr>
-      <w:tr>
-        <w:trPr>
-          <w:cantSplit/>
-        </w:trPr>
-        <w:tc>
-          <w:tcPr>
-            <w:tcW w:type="dxa" w:w="5832"/>
-            <w:vAlign w:val="center"/>
-            <w:shd w:fill="FFFFFF"/>
-            <w:tcMar>
-              <w:top w:w="50" w:type="dxa"/>
-              <w:left w:w="85" w:type="dxa"/>
-              <w:bottom w:w="50" w:type="dxa"/>
-              <w:right w:w="85" w:type="dxa"/>
-            </w:tcMar>
-          </w:tcPr>
-          <w:p>
-            <w:pPr>
-              <w:spacing w:after="0" w:line="240" w:lineRule="auto"/>
-            </w:pPr>
-            <w:r>
-              <w:rPr>
-                <w:sz w:val="18"/>
-              </w:rPr>
-              <w:t>CalculatorDemo.main</w:t>
-            </w:r>
-          </w:p>
-        </w:tc>
-        <w:tc>
-          <w:tcPr>
-            <w:tcW w:type="dxa" w:w="3888"/>
-            <w:vAlign w:val="center"/>
-            <w:shd w:fill="FFFFFF"/>
-            <w:tcMar>
-              <w:top w:w="50" w:type="dxa"/>
-              <w:left w:w="85" w:type="dxa"/>
-              <w:bottom w:w="50" w:type="dxa"/>
-              <w:right w:w="85" w:type="dxa"/>
-            </w:tcMar>
-          </w:tcPr>
-          <w:p>
-            <w:pPr>
-              <w:spacing w:after="0" w:line="240" w:lineRule="auto"/>
-            </w:pPr>
-            <w:r>
-              <w:rPr>
-                <w:sz w:val="18"/>
-              </w:rPr>
-              <w:t>calculator: Calculator (L20); exception: ArithmeticException (L45)</w:t>
-            </w:r>
-          </w:p>
-        </w:tc>
-      </w:tr>
-      <w:tr>
-        <w:trPr>
-          <w:cantSplit/>
-        </w:trPr>
-        <w:tc>
-          <w:tcPr>
-            <w:tcW w:type="dxa" w:w="5832"/>
-            <w:vAlign w:val="center"/>
-            <w:shd w:fill="F0F4F7"/>
-            <w:tcMar>
-              <w:top w:w="50" w:type="dxa"/>
-              <w:left w:w="85" w:type="dxa"/>
-              <w:bottom w:w="50" w:type="dxa"/>
-              <w:right w:w="85" w:type="dxa"/>
-            </w:tcMar>
-          </w:tcPr>
-          <w:p>
-            <w:pPr>
-              <w:spacing w:after="0" w:line="240" w:lineRule="auto"/>
-            </w:pPr>
-            <w:r>
-              <w:rPr>
-                <w:sz w:val="18"/>
-              </w:rPr>
-              <w:t>CalculatorDemo.showCalculation</w:t>
-            </w:r>
-          </w:p>
-        </w:tc>
-        <w:tc>
-          <w:tcPr>
-            <w:tcW w:type="dxa" w:w="3888"/>
-            <w:vAlign w:val="center"/>
-            <w:shd w:fill="F0F4F7"/>
-            <w:tcMar>
-              <w:top w:w="50" w:type="dxa"/>
-              <w:left w:w="85" w:type="dxa"/>
-              <w:bottom w:w="50" w:type="dxa"/>
-              <w:right w:w="85" w:type="dxa"/>
-            </w:tcMar>
-          </w:tcPr>
-          <w:p>
-            <w:pPr>
-              <w:spacing w:after="0" w:line="240" w:lineRule="auto"/>
-            </w:pPr>
-            <w:r>
-              <w:rPr>
-                <w:sz w:val="18"/>
-              </w:rPr>
-              <w:t>result: BigDecimal (L59)</w:t>
-            </w:r>
-          </w:p>
-        </w:tc>
-      </w:tr>
-      <w:tr>
-        <w:trPr>
-          <w:cantSplit/>
-        </w:trPr>
-        <w:tc>
-          <w:tcPr>
-            <w:tcW w:type="dxa" w:w="5832"/>
-            <w:vAlign w:val="center"/>
-            <w:shd w:fill="FFFFFF"/>
-            <w:tcMar>
-              <w:top w:w="50" w:type="dxa"/>
-              <w:left w:w="85" w:type="dxa"/>
-              <w:bottom w:w="50" w:type="dxa"/>
-              <w:right w:w="85" w:type="dxa"/>
-            </w:tcMar>
-          </w:tcPr>
-          <w:p>
-            <w:pPr>
-              <w:spacing w:after="0" w:line="240" w:lineRule="auto"/>
-            </w:pPr>
-            <w:r>
-              <w:rPr>
-                <w:sz w:val="18"/>
-              </w:rPr>
-              <w:t>CalculatorTest.sameContextSwitchesAlgorithmsAtRuntime</w:t>
-            </w:r>
-          </w:p>
-        </w:tc>
-        <w:tc>
-          <w:tcPr>
-            <w:tcW w:type="dxa" w:w="3888"/>
-            <w:vAlign w:val="center"/>
-            <w:shd w:fill="FFFFFF"/>
-            <w:tcMar>
-              <w:top w:w="50" w:type="dxa"/>
-              <w:left w:w="85" w:type="dxa"/>
-              <w:bottom w:w="50" w:type="dxa"/>
-              <w:right w:w="85" w:type="dxa"/>
-            </w:tcMar>
-          </w:tcPr>
-          <w:p>
-            <w:pPr>
-              <w:spacing w:after="0" w:line="240" w:lineRule="auto"/>
-            </w:pPr>
-            <w:r>
-              <w:rPr>
-                <w:sz w:val="18"/>
-              </w:rPr>
-              <w:t>calculator: Calculator (L21); left: BigDecimal (L22); right: BigDecimal (L23)</w:t>
-            </w:r>
-          </w:p>
-        </w:tc>
-      </w:tr>
-      <w:tr>
-        <w:trPr>
-          <w:cantSplit/>
-        </w:trPr>
-        <w:tc>
-          <w:tcPr>
-            <w:tcW w:type="dxa" w:w="5832"/>
-            <w:vAlign w:val="center"/>
-            <w:shd w:fill="F0F4F7"/>
-            <w:tcMar>
-              <w:top w:w="50" w:type="dxa"/>
-              <w:left w:w="85" w:type="dxa"/>
-              <w:bottom w:w="50" w:type="dxa"/>
-              <w:right w:w="85" w:type="dxa"/>
-            </w:tcMar>
-          </w:tcPr>
-          <w:p>
-            <w:pPr>
-              <w:spacing w:after="0" w:line="240" w:lineRule="auto"/>
-            </w:pPr>
-            <w:r>
-              <w:rPr>
-                <w:sz w:val="18"/>
-              </w:rPr>
-              <w:t>CalculatorTest.customStrategyWorksWithoutContextChanges</w:t>
-            </w:r>
-          </w:p>
-        </w:tc>
-        <w:tc>
-          <w:tcPr>
-            <w:tcW w:type="dxa" w:w="3888"/>
-            <w:vAlign w:val="center"/>
-            <w:shd w:fill="F0F4F7"/>
-            <w:tcMar>
-              <w:top w:w="50" w:type="dxa"/>
-              <w:left w:w="85" w:type="dxa"/>
-              <w:bottom w:w="50" w:type="dxa"/>
-              <w:right w:w="85" w:type="dxa"/>
-            </w:tcMar>
-          </w:tcPr>
-          <w:p>
-            <w:pPr>
-              <w:spacing w:after="0" w:line="240" w:lineRule="auto"/>
-            </w:pPr>
-            <w:r>
-              <w:rPr>
-                <w:sz w:val="18"/>
-              </w:rPr>
-              <w:t>calculator: Calculator (L34); left: inferred (L34); right: inferred (L34); result: BigDecimal (L36)</w:t>
-            </w:r>
-          </w:p>
-        </w:tc>
-      </w:tr>
-      <w:tr>
-        <w:trPr>
-          <w:cantSplit/>
-        </w:trPr>
-        <w:tc>
-          <w:tcPr>
-            <w:tcW w:type="dxa" w:w="5832"/>
-            <w:vAlign w:val="center"/>
-            <w:shd w:fill="FFFFFF"/>
-            <w:tcMar>
-              <w:top w:w="50" w:type="dxa"/>
-              <w:left w:w="85" w:type="dxa"/>
-              <w:bottom w:w="50" w:type="dxa"/>
-              <w:right w:w="85" w:type="dxa"/>
-            </w:tcMar>
-          </w:tcPr>
-          <w:p>
-            <w:pPr>
-              <w:spacing w:after="0" w:line="240" w:lineRule="auto"/>
-            </w:pPr>
-            <w:r>
-              <w:rPr>
-                <w:sz w:val="18"/>
-              </w:rPr>
-              <w:t>CalculatorTest.rejectedReplacementPreservesPreviousStrategy</w:t>
-            </w:r>
-          </w:p>
-        </w:tc>
-        <w:tc>
-          <w:tcPr>
-            <w:tcW w:type="dxa" w:w="3888"/>
-            <w:vAlign w:val="center"/>
-            <w:shd w:fill="FFFFFF"/>
-            <w:tcMar>
-              <w:top w:w="50" w:type="dxa"/>
-              <w:left w:w="85" w:type="dxa"/>
-              <w:bottom w:w="50" w:type="dxa"/>
-              <w:right w:w="85" w:type="dxa"/>
-            </w:tcMar>
-          </w:tcPr>
-          <w:p>
-            <w:pPr>
-              <w:spacing w:after="0" w:line="240" w:lineRule="auto"/>
-            </w:pPr>
-            <w:r>
-              <w:rPr>
-                <w:sz w:val="18"/>
-              </w:rPr>
-              <w:t>calculator: Calculator (L43)</w:t>
-            </w:r>
-          </w:p>
-        </w:tc>
-      </w:tr>
-      <w:tr>
-        <w:trPr>
-          <w:cantSplit/>
-        </w:trPr>
-        <w:tc>
-          <w:tcPr>
-            <w:tcW w:type="dxa" w:w="5832"/>
-            <w:vAlign w:val="center"/>
-            <w:shd w:fill="F0F4F7"/>
-            <w:tcMar>
-              <w:top w:w="50" w:type="dxa"/>
-              <w:left w:w="85" w:type="dxa"/>
-              <w:bottom w:w="50" w:type="dxa"/>
-              <w:right w:w="85" w:type="dxa"/>
-            </w:tcMar>
-          </w:tcPr>
-          <w:p>
-            <w:pPr>
-              <w:spacing w:after="0" w:line="240" w:lineRule="auto"/>
-            </w:pPr>
-            <w:r>
-              <w:rPr>
-                <w:sz w:val="18"/>
-              </w:rPr>
-              <w:t>CalculatorTest.missingLeftOperandIsRejected</w:t>
-            </w:r>
-          </w:p>
-        </w:tc>
-        <w:tc>
-          <w:tcPr>
-            <w:tcW w:type="dxa" w:w="3888"/>
-            <w:vAlign w:val="center"/>
-            <w:shd w:fill="F0F4F7"/>
-            <w:tcMar>
-              <w:top w:w="50" w:type="dxa"/>
-              <w:left w:w="85" w:type="dxa"/>
-              <w:bottom w:w="50" w:type="dxa"/>
-              <w:right w:w="85" w:type="dxa"/>
-            </w:tcMar>
-          </w:tcPr>
-          <w:p>
-            <w:pPr>
-              <w:spacing w:after="0" w:line="240" w:lineRule="auto"/>
-            </w:pPr>
-            <w:r>
-              <w:rPr>
-                <w:sz w:val="18"/>
-              </w:rPr>
-              <w:t>calculator: Calculator (L52)</w:t>
-            </w:r>
-          </w:p>
-        </w:tc>
-      </w:tr>
-      <w:tr>
-        <w:trPr>
-          <w:cantSplit/>
-        </w:trPr>
-        <w:tc>
-          <w:tcPr>
-            <w:tcW w:type="dxa" w:w="5832"/>
-            <w:vAlign w:val="center"/>
-            <w:shd w:fill="FFFFFF"/>
-            <w:tcMar>
-              <w:top w:w="50" w:type="dxa"/>
-              <w:left w:w="85" w:type="dxa"/>
-              <w:bottom w:w="50" w:type="dxa"/>
-              <w:right w:w="85" w:type="dxa"/>
-            </w:tcMar>
-          </w:tcPr>
-          <w:p>
-            <w:pPr>
-              <w:spacing w:after="0" w:line="240" w:lineRule="auto"/>
-            </w:pPr>
-            <w:r>
-              <w:rPr>
-                <w:sz w:val="18"/>
-              </w:rPr>
-              <w:t>CalculatorTest.missingRightOperandIsRejected</w:t>
-            </w:r>
-          </w:p>
-        </w:tc>
-        <w:tc>
-          <w:tcPr>
-            <w:tcW w:type="dxa" w:w="3888"/>
-            <w:vAlign w:val="center"/>
-            <w:shd w:fill="FFFFFF"/>
-            <w:tcMar>
-              <w:top w:w="50" w:type="dxa"/>
-              <w:left w:w="85" w:type="dxa"/>
-              <w:bottom w:w="50" w:type="dxa"/>
-              <w:right w:w="85" w:type="dxa"/>
-            </w:tcMar>
-          </w:tcPr>
-          <w:p>
-            <w:pPr>
-              <w:spacing w:after="0" w:line="240" w:lineRule="auto"/>
-            </w:pPr>
-            <w:r>
-              <w:rPr>
-                <w:sz w:val="18"/>
-              </w:rPr>
-              <w:t>calculator: Calculator (L58)</w:t>
-            </w:r>
-          </w:p>
-        </w:tc>
-      </w:tr>
-      <w:tr>
-        <w:trPr>
-          <w:cantSplit/>
-        </w:trPr>
-        <w:tc>
-          <w:tcPr>
-            <w:tcW w:type="dxa" w:w="5832"/>
-            <w:vAlign w:val="center"/>
-            <w:shd w:fill="F0F4F7"/>
-            <w:tcMar>
-              <w:top w:w="50" w:type="dxa"/>
-              <w:left w:w="85" w:type="dxa"/>
-              <w:bottom w:w="50" w:type="dxa"/>
-              <w:right w:w="85" w:type="dxa"/>
-            </w:tcMar>
-          </w:tcPr>
-          <w:p>
-            <w:pPr>
-              <w:spacing w:after="0" w:line="240" w:lineRule="auto"/>
-            </w:pPr>
-            <w:r>
-              <w:rPr>
-                <w:sz w:val="18"/>
-              </w:rPr>
-              <w:t>CalculatorTest.switchingBackRestoresOriginalAlgorithm</w:t>
-            </w:r>
-          </w:p>
-        </w:tc>
-        <w:tc>
-          <w:tcPr>
-            <w:tcW w:type="dxa" w:w="3888"/>
-            <w:vAlign w:val="center"/>
-            <w:shd w:fill="F0F4F7"/>
-            <w:tcMar>
-              <w:top w:w="50" w:type="dxa"/>
-              <w:left w:w="85" w:type="dxa"/>
-              <w:bottom w:w="50" w:type="dxa"/>
-              <w:right w:w="85" w:type="dxa"/>
-            </w:tcMar>
-          </w:tcPr>
-          <w:p>
-            <w:pPr>
-              <w:spacing w:after="0" w:line="240" w:lineRule="auto"/>
-            </w:pPr>
-            <w:r>
-              <w:rPr>
-                <w:sz w:val="18"/>
-              </w:rPr>
-              <w:t>calculator: Calculator (L64); result: BigDecimal (L68)</w:t>
-            </w:r>
-          </w:p>
-        </w:tc>
-      </w:tr>
-      <w:tr>
-        <w:trPr>
-          <w:cantSplit/>
-        </w:trPr>
-        <w:tc>
-          <w:tcPr>
-            <w:tcW w:type="dxa" w:w="5832"/>
-            <w:vAlign w:val="center"/>
-            <w:shd w:fill="FFFFFF"/>
-            <w:tcMar>
-              <w:top w:w="50" w:type="dxa"/>
-              <w:left w:w="85" w:type="dxa"/>
-              <w:bottom w:w="50" w:type="dxa"/>
-              <w:right w:w="85" w:type="dxa"/>
-            </w:tcMar>
-          </w:tcPr>
-          <w:p>
-            <w:pPr>
-              <w:spacing w:after="0" w:line="240" w:lineRule="auto"/>
-            </w:pPr>
-            <w:r>
-              <w:rPr>
-                <w:sz w:val="18"/>
-              </w:rPr>
-              <w:t>CalculatorTest.contextCanSwitchAfterAnAlgorithmRejectsAnOperation</w:t>
-            </w:r>
-          </w:p>
-        </w:tc>
-        <w:tc>
-          <w:tcPr>
-            <w:tcW w:type="dxa" w:w="3888"/>
-            <w:vAlign w:val="center"/>
-            <w:shd w:fill="FFFFFF"/>
-            <w:tcMar>
-              <w:top w:w="50" w:type="dxa"/>
-              <w:left w:w="85" w:type="dxa"/>
-              <w:bottom w:w="50" w:type="dxa"/>
-              <w:right w:w="85" w:type="dxa"/>
-            </w:tcMar>
-          </w:tcPr>
-          <w:p>
-            <w:pPr>
-              <w:spacing w:after="0" w:line="240" w:lineRule="auto"/>
-            </w:pPr>
-            <w:r>
-              <w:rPr>
-                <w:sz w:val="18"/>
-              </w:rPr>
-              <w:t>calculator: Calculator (L75); result: BigDecimal (L80)</w:t>
-            </w:r>
-          </w:p>
-        </w:tc>
-      </w:tr>
-      <w:tr>
-        <w:trPr>
-          <w:cantSplit/>
-        </w:trPr>
-        <w:tc>
-          <w:tcPr>
-            <w:tcW w:type="dxa" w:w="5832"/>
-            <w:vAlign w:val="center"/>
-            <w:shd w:fill="F0F4F7"/>
-            <w:tcMar>
-              <w:top w:w="50" w:type="dxa"/>
-              <w:left w:w="85" w:type="dxa"/>
-              <w:bottom w:w="50" w:type="dxa"/>
-              <w:right w:w="85" w:type="dxa"/>
-            </w:tcMar>
-          </w:tcPr>
-          <w:p>
-            <w:pPr>
-              <w:spacing w:after="0" w:line="240" w:lineRule="auto"/>
-            </w:pPr>
-            <w:r>
-              <w:rPr>
-                <w:sz w:val="18"/>
-              </w:rPr>
-              <w:t>StrategyTest.strategiesProduceExpectedNumbers</w:t>
-            </w:r>
-          </w:p>
-        </w:tc>
-        <w:tc>
-          <w:tcPr>
-            <w:tcW w:type="dxa" w:w="3888"/>
-            <w:vAlign w:val="center"/>
-            <w:shd w:fill="F0F4F7"/>
-            <w:tcMar>
-              <w:top w:w="50" w:type="dxa"/>
-              <w:left w:w="85" w:type="dxa"/>
-              <w:bottom w:w="50" w:type="dxa"/>
-              <w:right w:w="85" w:type="dxa"/>
-            </w:tcMar>
-          </w:tcPr>
-          <w:p>
-            <w:pPr>
-              <w:spacing w:after="0" w:line="240" w:lineRule="auto"/>
-            </w:pPr>
-            <w:r>
-              <w:rPr>
-                <w:sz w:val="18"/>
-              </w:rPr>
-              <w:t>result: BigDecimal (L22)</w:t>
-            </w:r>
-          </w:p>
-        </w:tc>
-      </w:tr>
-      <w:tr>
-        <w:trPr>
-          <w:cantSplit/>
-        </w:trPr>
-        <w:tc>
-          <w:tcPr>
-            <w:tcW w:type="dxa" w:w="5832"/>
-            <w:vAlign w:val="center"/>
-            <w:shd w:fill="FFFFFF"/>
-            <w:tcMar>
-              <w:top w:w="50" w:type="dxa"/>
-              <w:left w:w="85" w:type="dxa"/>
-              <w:bottom w:w="50" w:type="dxa"/>
-              <w:right w:w="85" w:type="dxa"/>
-            </w:tcMar>
-          </w:tcPr>
-          <w:p>
-            <w:pPr>
-              <w:spacing w:after="0" w:line="240" w:lineRule="auto"/>
-            </w:pPr>
-            <w:r>
-              <w:rPr>
-                <w:sz w:val="18"/>
-              </w:rPr>
-              <w:t>StrategyTest.decimalAdditionIsExact</w:t>
-            </w:r>
-          </w:p>
-        </w:tc>
-        <w:tc>
-          <w:tcPr>
-            <w:tcW w:type="dxa" w:w="3888"/>
-            <w:vAlign w:val="center"/>
-            <w:shd w:fill="FFFFFF"/>
-            <w:tcMar>
-              <w:top w:w="50" w:type="dxa"/>
-              <w:left w:w="85" w:type="dxa"/>
-              <w:bottom w:w="50" w:type="dxa"/>
-              <w:right w:w="85" w:type="dxa"/>
-            </w:tcMar>
-          </w:tcPr>
-          <w:p>
-            <w:pPr>
-              <w:spacing w:after="0" w:line="240" w:lineRule="auto"/>
-            </w:pPr>
-            <w:r>
-              <w:rPr>
-                <w:sz w:val="18"/>
-              </w:rPr>
-              <w:t>strategy: CalculationStrategy (L50); result: BigDecimal (L52)</w:t>
-            </w:r>
-          </w:p>
-        </w:tc>
-      </w:tr>
-      <w:tr>
-        <w:trPr>
-          <w:cantSplit/>
-        </w:trPr>
-        <w:tc>
-          <w:tcPr>
-            <w:tcW w:type="dxa" w:w="5832"/>
-            <w:vAlign w:val="center"/>
-            <w:shd w:fill="F0F4F7"/>
-            <w:tcMar>
-              <w:top w:w="50" w:type="dxa"/>
-              <w:left w:w="85" w:type="dxa"/>
-              <w:bottom w:w="50" w:type="dxa"/>
-              <w:right w:w="85" w:type="dxa"/>
-            </w:tcMar>
-          </w:tcPr>
-          <w:p>
-            <w:pPr>
-              <w:spacing w:after="0" w:line="240" w:lineRule="auto"/>
-            </w:pPr>
-            <w:r>
-              <w:rPr>
-                <w:sz w:val="18"/>
-              </w:rPr>
-              <w:t>StrategyTest.algorithmInstanceDoesNotStorePreviousResults</w:t>
-            </w:r>
-          </w:p>
-        </w:tc>
-        <w:tc>
-          <w:tcPr>
-            <w:tcW w:type="dxa" w:w="3888"/>
-            <w:vAlign w:val="center"/>
-            <w:shd w:fill="F0F4F7"/>
-            <w:tcMar>
-              <w:top w:w="50" w:type="dxa"/>
-              <w:left w:w="85" w:type="dxa"/>
-              <w:bottom w:w="50" w:type="dxa"/>
-              <w:right w:w="85" w:type="dxa"/>
-            </w:tcMar>
-          </w:tcPr>
-          <w:p>
-            <w:pPr>
-              <w:spacing w:after="0" w:line="240" w:lineRule="auto"/>
-            </w:pPr>
-            <w:r>
-              <w:rPr>
-                <w:sz w:val="18"/>
-              </w:rPr>
-              <w:t>strategy: CalculationStrategy (L59); result: BigDecimal (L62)</w:t>
-            </w:r>
-          </w:p>
-        </w:tc>
-      </w:tr>
-      <w:tr>
-        <w:trPr>
-          <w:cantSplit/>
-        </w:trPr>
-        <w:tc>
-          <w:tcPr>
-            <w:tcW w:type="dxa" w:w="5832"/>
-            <w:vAlign w:val="center"/>
-            <w:shd w:fill="FFFFFF"/>
-            <w:tcMar>
-              <w:top w:w="50" w:type="dxa"/>
-              <w:left w:w="85" w:type="dxa"/>
-              <w:bottom w:w="50" w:type="dxa"/>
-              <w:right w:w="85" w:type="dxa"/>
-            </w:tcMar>
-          </w:tcPr>
-          <w:p>
-            <w:pPr>
-              <w:spacing w:after="0" w:line="240" w:lineRule="auto"/>
-            </w:pPr>
-            <w:r>
-              <w:rPr>
-                <w:sz w:val="18"/>
-              </w:rPr>
-              <w:t>StrategyTest.divisionRejectsZeroInEveryRepresentation</w:t>
-            </w:r>
-          </w:p>
-        </w:tc>
-        <w:tc>
-          <w:tcPr>
-            <w:tcW w:type="dxa" w:w="3888"/>
-            <w:vAlign w:val="center"/>
-            <w:shd w:fill="FFFFFF"/>
-            <w:tcMar>
-              <w:top w:w="50" w:type="dxa"/>
-              <w:left w:w="85" w:type="dxa"/>
-              <w:bottom w:w="50" w:type="dxa"/>
-              <w:right w:w="85" w:type="dxa"/>
-            </w:tcMar>
-          </w:tcPr>
-          <w:p>
-            <w:pPr>
-              <w:spacing w:after="0" w:line="240" w:lineRule="auto"/>
-            </w:pPr>
-            <w:r>
-              <w:rPr>
-                <w:sz w:val="18"/>
-              </w:rPr>
-              <w:t>strategy: CalculationStrategy (L70)</w:t>
-            </w:r>
-          </w:p>
-        </w:tc>
-      </w:tr>
-      <w:tr>
-        <w:trPr>
-          <w:cantSplit/>
-        </w:trPr>
-        <w:tc>
-          <w:tcPr>
-            <w:tcW w:type="dxa" w:w="5832"/>
-            <w:vAlign w:val="center"/>
-            <w:shd w:fill="F0F4F7"/>
-            <w:tcMar>
-              <w:top w:w="50" w:type="dxa"/>
-              <w:left w:w="85" w:type="dxa"/>
-              <w:bottom w:w="50" w:type="dxa"/>
-              <w:right w:w="85" w:type="dxa"/>
-            </w:tcMar>
-          </w:tcPr>
-          <w:p>
-            <w:pPr>
-              <w:spacing w:after="0" w:line="240" w:lineRule="auto"/>
-            </w:pPr>
-            <w:r>
-              <w:rPr>
-                <w:sz w:val="18"/>
-              </w:rPr>
-              <w:t>StrategyTest.recurringDivisionUsesTheDocumentedPrecision</w:t>
-            </w:r>
-          </w:p>
-        </w:tc>
-        <w:tc>
-          <w:tcPr>
-            <w:tcW w:type="dxa" w:w="3888"/>
-            <w:vAlign w:val="center"/>
-            <w:shd w:fill="F0F4F7"/>
-            <w:tcMar>
-              <w:top w:w="50" w:type="dxa"/>
-              <w:left w:w="85" w:type="dxa"/>
-              <w:bottom w:w="50" w:type="dxa"/>
-              <w:right w:w="85" w:type="dxa"/>
-            </w:tcMar>
-          </w:tcPr>
-          <w:p>
-            <w:pPr>
-              <w:spacing w:after="0" w:line="240" w:lineRule="auto"/>
-            </w:pPr>
-            <w:r>
-              <w:rPr>
-                <w:sz w:val="18"/>
-              </w:rPr>
-              <w:t>strategy: CalculationStrategy (L77); result: BigDecimal (L79)</w:t>
-            </w:r>
-          </w:p>
-        </w:tc>
-      </w:tr>
-    </w:tbl>
-    <w:p>
-      <w:pPr>
-        <w:spacing w:after="20"/>
-      </w:pPr>
-    </w:p>
-    <w:p>
-      <w:r>
-        <w:t>Editable UML: docs/class-diagram.puml. Full text: docs/uml-inventory.md. Machine-readable declarations: docs/code-inventory.json.</w:t>
+        <w:rPr>
+          <w:sz w:val="18"/>
+        </w:rPr>
+        <w:t>Reference: Robert C. Martin, Clean Code (2008), Chapters 9, 10, and 11.</w:t>
       </w:r>
     </w:p>
     <w:sectPr>
       <w:pgSz w:w="11909" w:h="16834"/>
-      <w:pgMar w:top="936" w:right="1080" w:bottom="936" w:left="1080" w:header="720" w:footer="720" w:gutter="0"/>
+      <w:pgMar w:top="864" w:right="1080" w:bottom="864" w:left="1080" w:header="720" w:footer="720" w:gutter="0"/>
       <w:cols w:space="720"/>
       <w:docGrid w:linePitch="360"/>
     </w:sectPr>
@@ -3677,12 +676,12 @@
     <w:qFormat/>
     <w:rsid w:val="00FC693F"/>
     <w:pPr>
-      <w:spacing w:line="259" w:lineRule="auto" w:after="140"/>
+      <w:spacing w:line="245" w:lineRule="auto" w:after="100"/>
     </w:pPr>
     <w:rPr>
       <w:rFonts w:ascii="Arial" w:hAnsi="Arial"/>
       <w:color w:val="000000"/>
-      <w:sz w:val="21"/>
+      <w:sz w:val="20"/>
     </w:rPr>
   </w:style>
   <w:style w:type="paragraph" w:styleId="Header">
@@ -3740,7 +739,7 @@
     <w:pPr>
       <w:keepNext/>
       <w:keepLines/>
-      <w:spacing w:before="220" w:after="120"/>
+      <w:spacing w:before="120" w:after="80"/>
       <w:outlineLvl w:val="0"/>
     </w:pPr>
     <w:rPr>
@@ -3748,7 +747,7 @@
       <w:b/>
       <w:bCs/>
       <w:color w:val="000000"/>
-      <w:sz w:val="30"/>
+      <w:sz w:val="26"/>
       <w:szCs w:val="28"/>
     </w:rPr>
   </w:style>
@@ -3764,7 +763,7 @@
     <w:pPr>
       <w:keepNext/>
       <w:keepLines/>
-      <w:spacing w:before="220" w:after="120"/>
+      <w:spacing w:before="120" w:after="80"/>
       <w:outlineLvl w:val="1"/>
     </w:pPr>
     <w:rPr>
@@ -3772,7 +771,7 @@
       <w:b/>
       <w:bCs/>
       <w:color w:val="000000"/>
-      <w:sz w:val="24"/>
+      <w:sz w:val="21"/>
       <w:szCs w:val="26"/>
     </w:rPr>
   </w:style>
@@ -3792,10 +791,10 @@
       <w:outlineLvl w:val="2"/>
     </w:pPr>
     <w:rPr>
-      <w:rFonts w:asciiTheme="majorHAnsi" w:eastAsiaTheme="majorEastAsia" w:hAnsiTheme="majorHAnsi" w:cstheme="majorBidi" w:ascii="Arial" w:hAnsi="Arial"/>
+      <w:rFonts w:asciiTheme="majorHAnsi" w:eastAsiaTheme="majorEastAsia" w:hAnsiTheme="majorHAnsi" w:cstheme="majorBidi"/>
       <w:b/>
       <w:bCs/>
-      <w:color w:val="000000"/>
+      <w:color w:val="4F81BD" w:themeColor="accent1"/>
     </w:rPr>
   </w:style>
   <w:style w:type="paragraph" w:styleId="Heading4">
@@ -4026,7 +1025,7 @@
     <w:qFormat/>
     <w:rsid w:val="00FC693F"/>
     <w:pPr>
-      <w:spacing w:after="300" w:line="240" w:lineRule="auto"/>
+      <w:spacing w:after="80" w:line="240" w:lineRule="auto"/>
       <w:contextualSpacing/>
     </w:pPr>
     <w:rPr>
@@ -4034,7 +1033,7 @@
       <w:color w:val="000000"/>
       <w:spacing w:val="5"/>
       <w:kern w:val="28"/>
-      <w:sz w:val="48"/>
+      <w:sz w:val="40"/>
       <w:szCs w:val="52"/>
     </w:rPr>
   </w:style>
@@ -4065,6 +1064,7 @@
       <w:numPr>
         <w:ilvl w:val="1"/>
       </w:numPr>
+      <w:spacing w:after="100"/>
     </w:pPr>
     <w:rPr>
       <w:rFonts w:asciiTheme="majorHAnsi" w:eastAsiaTheme="majorEastAsia" w:hAnsiTheme="majorHAnsi" w:cstheme="majorBidi" w:ascii="Arial" w:hAnsi="Arial"/>
@@ -4072,7 +1072,7 @@
       <w:iCs/>
       <w:color w:val="000000"/>
       <w:spacing w:val="15"/>
-      <w:sz w:val="22"/>
+      <w:sz w:val="20"/>
       <w:szCs w:val="24"/>
     </w:rPr>
   </w:style>
@@ -15365,11 +12365,11 @@
     <w:name w:val="Code excerpt"/>
     <w:pPr>
       <w:keepLines/>
-      <w:spacing w:line="245" w:lineRule="auto" w:after="140"/>
+      <w:spacing w:line="240" w:lineRule="auto" w:after="120"/>
     </w:pPr>
     <w:rPr>
       <w:rFonts w:ascii="Consolas" w:hAnsi="Consolas"/>
-      <w:sz w:val="18"/>
+      <w:sz w:val="16"/>
     </w:rPr>
   </w:style>
 </w:styles>

</xml_diff>